<commit_message>
V-Trace branding in the app; final deck in the first-presentation theme
- App: V-Trace logo (dark/light variants by theme) on sign-in and sidebar, emblem as tab
  icon, NUS-ISS logo removed; Inter font; tagline header; white light theme
- Final presentation rebuilt in the first deck's design: wave artwork title/closing
  slides, logo, white content slides with subtitle + teal rule, pastel numbered cards,
  chevrons, navy key-message boxes (Aptos Display / Aptos)
- First presentation deliverable is now the presented PDF
- Screenshots, report and guides regenerated

Co-Authored-By: Claude Opus 5.5 <noreply@anthropic.com>
</commit_message>
<xml_diff>
--- a/deliverables/V-Trace_Demo_Guide.docx
+++ b/deliverables/V-Trace_Demo_Guide.docx
@@ -2,42 +2,6 @@
 <file path=word/document.xml><?xml version="1.0" encoding="utf-8"?>
 <w:document xmlns:wpc="http://schemas.microsoft.com/office/word/2010/wordprocessingCanvas" xmlns:mo="http://schemas.microsoft.com/office/mac/office/2008/main" xmlns:mc="http://schemas.openxmlformats.org/markup-compatibility/2006" xmlns:mv="urn:schemas-microsoft-com:mac:vml" xmlns:o="urn:schemas-microsoft-com:office:office" xmlns:r="http://schemas.openxmlformats.org/officeDocument/2006/relationships" xmlns:m="http://schemas.openxmlformats.org/officeDocument/2006/math" xmlns:v="urn:schemas-microsoft-com:vml" xmlns:wp14="http://schemas.microsoft.com/office/word/2010/wordprocessingDrawing" xmlns:wp="http://schemas.openxmlformats.org/drawingml/2006/wordprocessingDrawing" xmlns:w10="urn:schemas-microsoft-com:office:word" xmlns:w="http://schemas.openxmlformats.org/wordprocessingml/2006/main" xmlns:w14="http://schemas.microsoft.com/office/word/2010/wordml" xmlns:wpg="http://schemas.microsoft.com/office/word/2010/wordprocessingGroup" xmlns:wpi="http://schemas.microsoft.com/office/word/2010/wordprocessingInk" xmlns:wne="http://schemas.microsoft.com/office/word/2006/wordml" xmlns:wps="http://schemas.microsoft.com/office/word/2010/wordprocessingShape" mc:Ignorable="w14 wp14">
   <w:body>
-    <w:p>
-      <w:r>
-        <w:drawing>
-          <wp:inline xmlns:a="http://schemas.openxmlformats.org/drawingml/2006/main" xmlns:pic="http://schemas.openxmlformats.org/drawingml/2006/picture">
-            <wp:extent cx="2160000" cy="653684"/>
-            <wp:docPr id="1" name="Picture 1"/>
-            <wp:cNvGraphicFramePr>
-              <a:graphicFrameLocks noChangeAspect="1"/>
-            </wp:cNvGraphicFramePr>
-            <a:graphic>
-              <a:graphicData uri="http://schemas.openxmlformats.org/drawingml/2006/picture">
-                <pic:pic>
-                  <pic:nvPicPr>
-                    <pic:cNvPr id="0" name="nus_iss_logo.png"/>
-                    <pic:cNvPicPr/>
-                  </pic:nvPicPr>
-                  <pic:blipFill>
-                    <a:blip r:embed="rId9"/>
-                    <a:stretch>
-                      <a:fillRect/>
-                    </a:stretch>
-                  </pic:blipFill>
-                  <pic:spPr>
-                    <a:xfrm>
-                      <a:off x="0" y="0"/>
-                      <a:ext cx="2160000" cy="653684"/>
-                    </a:xfrm>
-                    <a:prstGeom prst="rect"/>
-                  </pic:spPr>
-                </pic:pic>
-              </a:graphicData>
-            </a:graphic>
-          </wp:inline>
-        </w:drawing>
-      </w:r>
-    </w:p>
     <w:p/>
     <w:p/>
     <w:p/>
@@ -73,7 +37,7 @@
     <w:p>
       <w:pPr>
         <w:sectPr>
-          <w:footerReference w:type="default" r:id="rId10"/>
+          <w:footerReference w:type="default" r:id="rId9"/>
           <w:pgSz w:w="11906" w:h="16838"/>
           <w:pgMar w:top="1247" w:right="1247" w:bottom="1247" w:left="1247" w:header="720" w:footer="720" w:gutter="0"/>
           <w:cols w:space="720"/>
@@ -1310,7 +1274,7 @@
       </w:r>
     </w:p>
     <w:sectPr>
-      <w:footerReference w:type="default" r:id="rId11"/>
+      <w:footerReference w:type="default" r:id="rId10"/>
       <w:pgSz w:w="11906" w:h="16838"/>
       <w:pgMar w:top="1247" w:right="1247" w:bottom="1247" w:left="1247" w:header="720" w:footer="720" w:gutter="0"/>
       <w:cols w:space="720"/>

</xml_diff>

<commit_message>
Simpler app: one search page in the query -> ranked-matches style of Re-ID demos
- Search page: 1 find the vehicle (describe it, or pick it from a camera),
  2 its route across cameras, 3 where else was it seen (top-3 ranked matches per
  camera with one-click confirmation, re-ranked against every confirmed view)
- Analysis page: VeRi-776 results, SOM vehicle map, tracking check
- Demo cameras load automatically; uploads, matching settings and sign-out in the sidebar
- Uniform 4:3 thumbnails; evidence table behind "Why these matches?"
- Tests, screenshots, demo guide, report, README and deck updated

Co-Authored-By: Claude Opus 5.5 <noreply@anthropic.com>
</commit_message>
<xml_diff>
--- a/deliverables/V-Trace_Demo_Guide.docx
+++ b/deliverables/V-Trace_Demo_Guide.docx
@@ -66,16 +66,7 @@
         <w:t>Option A – hosted (no install).</w:t>
       </w:r>
       <w:r>
-        <w:t xml:space="preserve"> Open the Streamlit Community Cloud link shared with the submission and sign in with the assessor account provided with it. The hosted app runs on a small CPU, so use the </w:t>
-      </w:r>
-      <w:r>
-        <w:rPr>
-          <w:b/>
-        </w:rPr>
-        <w:t>▶ Quick demo</w:t>
-      </w:r>
-      <w:r>
-        <w:t xml:space="preserve"> button (the demo cameras are pre-processed) rather than uploading long videos.</w:t>
+        <w:t xml:space="preserve"> Open the Streamlit Community Cloud link shared with the submission and sign in with the assessor account provided with it. The four demo cameras load automatically.</w:t>
       </w:r>
     </w:p>
     <w:p>
@@ -148,37 +139,6 @@
         <w:spacing w:after="60"/>
       </w:pPr>
       <w:r>
-        <w:t xml:space="preserve">Put the trained models in </w:t>
-      </w:r>
-      <w:r>
-        <w:rPr>
-          <w:rFonts w:ascii="Consolas" w:hAnsi="Consolas"/>
-          <w:color w:val="0E8782"/>
-          <w:sz w:val="20"/>
-        </w:rPr>
-        <w:t>models/</w:t>
-      </w:r>
-      <w:r>
-        <w:t xml:space="preserve"> and the four demo videos in </w:t>
-      </w:r>
-      <w:r>
-        <w:rPr>
-          <w:rFonts w:ascii="Consolas" w:hAnsi="Consolas"/>
-          <w:color w:val="0E8782"/>
-          <w:sz w:val="20"/>
-        </w:rPr>
-        <w:t>data/videos/</w:t>
-      </w:r>
-      <w:r>
-        <w:t xml:space="preserve"> (both are in the submission ZIP).</w:t>
-      </w:r>
-    </w:p>
-    <w:p>
-      <w:pPr>
-        <w:pStyle w:val="ListNumber"/>
-        <w:spacing w:after="60"/>
-      </w:pPr>
-      <w:r>
         <w:rPr>
           <w:rFonts w:ascii="Consolas" w:hAnsi="Consolas"/>
           <w:color w:val="0E8782"/>
@@ -192,7 +152,25 @@
     </w:p>
     <w:p>
       <w:r>
-        <w:t>The app opens in dark mode; switch with ⋮ (top right) → Settings → Theme.</w:t>
+        <w:t xml:space="preserve">The app has two pages (left sidebar): </w:t>
+      </w:r>
+      <w:r>
+        <w:rPr>
+          <w:b/>
+        </w:rPr>
+        <w:t>Search</w:t>
+      </w:r>
+      <w:r>
+        <w:t xml:space="preserve"> and </w:t>
+      </w:r>
+      <w:r>
+        <w:rPr>
+          <w:b/>
+        </w:rPr>
+        <w:t>Analysis</w:t>
+      </w:r>
+      <w:r>
+        <w:t>. It opens in dark mode; switch with ⋮ (top right) → Settings → Theme.</w:t>
       </w:r>
     </w:p>
     <w:p>
@@ -208,10 +186,10 @@
         <w:rPr>
           <w:b/>
         </w:rPr>
-        <w:t>The cameras.</w:t>
+        <w:t>The cameras</w:t>
       </w:r>
       <w:r>
-        <w:t xml:space="preserve"> </w:t>
+        <w:t xml:space="preserve"> (listed in the sidebar). </w:t>
       </w:r>
       <w:r>
         <w:rPr>
@@ -255,39 +233,36 @@
         <w:t>camD_other_road</w:t>
       </w:r>
       <w:r>
-        <w:t xml:space="preserve"> is a different road whose vehicles never appear in A–C, so it must never be chosen.</w:t>
+        <w:t xml:space="preserve"> is a different road whose vehicles never appear in A–C, so it should never be confirmed.</w:t>
       </w:r>
     </w:p>
     <w:p>
       <w:r>
-        <w:t xml:space="preserve">Sign in, open tab </w:t>
+        <w:t xml:space="preserve">The Search page has three steps: </w:t>
       </w:r>
       <w:r>
         <w:rPr>
           <w:b/>
         </w:rPr>
-        <w:t>1 · Upload videos</w:t>
+        <w:t>① Find the vehicle</w:t>
       </w:r>
       <w:r>
-        <w:t xml:space="preserve"> and click </w:t>
+        <w:t xml:space="preserve">, </w:t>
       </w:r>
       <w:r>
         <w:rPr>
           <w:b/>
         </w:rPr>
-        <w:t>▶ Quick demo</w:t>
+        <w:t>② Its route across the cameras</w:t>
       </w:r>
       <w:r>
-        <w:t xml:space="preserve">. The four cameras load (instantly if they were processed before, or from the pre-processed demo bundle on the hosted app). The sidebar shows </w:t>
+        <w:t xml:space="preserve">, </w:t>
       </w:r>
       <w:r>
         <w:rPr>
           <w:b/>
         </w:rPr>
-        <w:t>187 vehicles</w:t>
-      </w:r>
-      <w:r>
-        <w:t>.</w:t>
+        <w:t>③ Where else was it seen?</w:t>
       </w:r>
     </w:p>
     <w:p>
@@ -295,7 +270,7 @@
         <w:rPr>
           <w:b/>
         </w:rPr>
-        <w:t>Scenario A – trace a car by confirming each camera (main demo, about 2 minutes)</w:t>
+        <w:t>Scenario A – trace a car through three cameras (main demo, about 2 minutes)</w:t>
       </w:r>
     </w:p>
     <w:p>
@@ -304,13 +279,10 @@
         <w:spacing w:after="60"/>
       </w:pPr>
       <w:r>
-        <w:t xml:space="preserve">Tab </w:t>
-      </w:r>
-      <w:r>
         <w:rPr>
           <w:b/>
         </w:rPr>
-        <w:t>2 · Describe &amp; search</w:t>
+        <w:t>① Find the vehicle → Describe it</w:t>
       </w:r>
       <w:r>
         <w:t xml:space="preserve">: Colour </w:t>
@@ -322,7 +294,7 @@
         <w:t>red</w:t>
       </w:r>
       <w:r>
-        <w:t xml:space="preserve">, Vehicle type </w:t>
+        <w:t xml:space="preserve">, Type </w:t>
       </w:r>
       <w:r>
         <w:rPr>
@@ -351,16 +323,16 @@
         <w:t>Expect:</w:t>
       </w:r>
       <w:r>
-        <w:t xml:space="preserve"> #1 is </w:t>
+        <w:t xml:space="preserve"> #1 is a red Citroën in </w:t>
       </w:r>
       <w:r>
         <w:rPr>
           <w:b/>
         </w:rPr>
-        <w:t>camA_west · track 481</w:t>
+        <w:t>camA_west, 00:40.80–00:42.24</w:t>
       </w:r>
       <w:r>
-        <w:t xml:space="preserve"> (00:40.80–00:42.24), a red Citroën.</w:t>
+        <w:t>.</w:t>
       </w:r>
     </w:p>
     <w:p>
@@ -375,16 +347,36 @@
         <w:rPr>
           <w:b/>
         </w:rPr>
-        <w:t>✅ Confirm this vehicle</w:t>
+        <w:t>Select</w:t>
       </w:r>
       <w:r>
-        <w:t xml:space="preserve"> on it, then open tab </w:t>
+        <w:t xml:space="preserve"> on it.</w:t>
+      </w:r>
+    </w:p>
+    <w:p>
+      <w:pPr>
+        <w:pStyle w:val="ListNumber"/>
+        <w:spacing w:after="60"/>
+      </w:pPr>
+      <w:r>
+        <w:rPr>
+          <w:b/>
+        </w:rPr>
+        <w:t>③ Where else was it seen?</w:t>
+      </w:r>
+      <w:r>
+        <w:t xml:space="preserve"> In the camB_centre row, the ⭐ #1 match is the same car (00:42.00–00:43.56).</w:t>
+      </w:r>
+    </w:p>
+    <w:p>
+      <w:r>
+        <w:t xml:space="preserve">Click </w:t>
       </w:r>
       <w:r>
         <w:rPr>
           <w:b/>
         </w:rPr>
-        <w:t>3 · Confirm &amp; re-identify</w:t>
+        <w:t>✓ Same vehicle</w:t>
       </w:r>
       <w:r>
         <w:t>.</w:t>
@@ -396,39 +388,7 @@
         <w:spacing w:after="60"/>
       </w:pPr>
       <w:r>
-        <w:t xml:space="preserve">Under </w:t>
-      </w:r>
-      <w:r>
-        <w:rPr>
-          <w:i/>
-        </w:rPr>
-        <w:t>Trace this vehicle's route</w:t>
-      </w:r>
-      <w:r>
-        <w:t xml:space="preserve">, the </w:t>
-      </w:r>
-      <w:r>
-        <w:rPr>
-          <w:b/>
-        </w:rPr>
-        <w:t>suggested route</w:t>
-      </w:r>
-      <w:r>
-        <w:t xml:space="preserve"> already adds </w:t>
-      </w:r>
-      <w:r>
-        <w:rPr>
-          <w:b/>
-        </w:rPr>
-        <w:t>camB_centre</w:t>
-      </w:r>
-      <w:r>
-        <w:t xml:space="preserve"> (⭐ on track 156,</w:t>
-      </w:r>
-    </w:p>
-    <w:p>
-      <w:r>
-        <w:t xml:space="preserve">00:42.00–00:43.56). In the camB_centre box click </w:t>
+        <w:t xml:space="preserve">The camC_east row is re-scored against both confirmed views. Click </w:t>
       </w:r>
       <w:r>
         <w:rPr>
@@ -437,25 +397,7 @@
         <w:t>✓ Same vehicle</w:t>
       </w:r>
       <w:r>
-        <w:t xml:space="preserve"> on track 156.</w:t>
-      </w:r>
-    </w:p>
-    <w:p>
-      <w:pPr>
-        <w:pStyle w:val="ListNumber"/>
-        <w:spacing w:after="60"/>
-      </w:pPr>
-      <w:r>
-        <w:t xml:space="preserve">The camC_east candidates are re-scored against both confirmed views. Click </w:t>
-      </w:r>
-      <w:r>
-        <w:rPr>
-          <w:b/>
-        </w:rPr>
-        <w:t>✓ Same vehicle</w:t>
-      </w:r>
-      <w:r>
-        <w:t xml:space="preserve"> on</w:t>
+        <w:t xml:space="preserve"> on the red Citroën at</w:t>
       </w:r>
     </w:p>
     <w:p>
@@ -463,10 +405,10 @@
         <w:rPr>
           <w:b/>
         </w:rPr>
-        <w:t>track 294</w:t>
+        <w:t>00:43.56–00:44.16</w:t>
       </w:r>
       <w:r>
-        <w:t xml:space="preserve"> (00:43.56–00:44.16; it is among the top three).</w:t>
+        <w:t xml:space="preserve"> (among the four shown).</w:t>
       </w:r>
     </w:p>
     <w:p>
@@ -487,15 +429,24 @@
         <w:rPr>
           <w:b/>
         </w:rPr>
-        <w:t>Confirmed route camA_west → camB_centre → camC_east</w:t>
+        <w:t>② Its route across the cameras</w:t>
       </w:r>
       <w:r>
-        <w:t xml:space="preserve"> at 0:41 → 0:42 → 0:43.6, with the red Citroën in</w:t>
+        <w:t xml:space="preserve"> shows camA 0:40.8 → camB 0:42.0 → camC 0:43.6, all confirmed.</w:t>
       </w:r>
     </w:p>
     <w:p>
       <w:r>
-        <w:t>all three crops. Scroll down to show the ranked candidates with their evidence vectors and frames.</w:t>
+        <w:t xml:space="preserve">Open </w:t>
+      </w:r>
+      <w:r>
+        <w:rPr>
+          <w:b/>
+        </w:rPr>
+        <w:t>Why these matches?</w:t>
+      </w:r>
+      <w:r>
+        <w:t xml:space="preserve"> to show the evidence behind each candidate.</w:t>
       </w:r>
     </w:p>
     <w:p>
@@ -503,7 +454,7 @@
         <w:rPr>
           <w:b/>
         </w:rPr>
-        <w:t>Scenario B – a fully automatic route</w:t>
+        <w:t>Scenario B – pick a vehicle straight from the footage</w:t>
       </w:r>
     </w:p>
     <w:p>
@@ -512,16 +463,36 @@
         <w:spacing w:after="60"/>
       </w:pPr>
       <w:r>
-        <w:t xml:space="preserve">Same search (red + sedan); confirm </w:t>
+        <w:rPr>
+          <w:b/>
+        </w:rPr>
+        <w:t>① Find the vehicle → Pick it from a camera</w:t>
+      </w:r>
+      <w:r>
+        <w:t xml:space="preserve">, camera </w:t>
       </w:r>
       <w:r>
         <w:rPr>
           <w:b/>
         </w:rPr>
-        <w:t>#2 camA_west · track 36</w:t>
+        <w:t>camA_west</w:t>
       </w:r>
       <w:r>
-        <w:t xml:space="preserve"> (00:00.96–00:06.72).</w:t>
+        <w:t>: every vehicle in that camera, in order of</w:t>
+      </w:r>
+    </w:p>
+    <w:p>
+      <w:r>
+        <w:t xml:space="preserve">appearance. Select the red car at </w:t>
+      </w:r>
+      <w:r>
+        <w:rPr>
+          <w:b/>
+        </w:rPr>
+        <w:t>00:00.96–00:06.72</w:t>
+      </w:r>
+      <w:r>
+        <w:t>.</w:t>
       </w:r>
     </w:p>
     <w:p>
@@ -536,7 +507,7 @@
         <w:t>Expect:</w:t>
       </w:r>
       <w:r>
-        <w:t xml:space="preserve"> the suggested route alone is camA → camB_centre (track 18) → camC_east (track 55), in time order.</w:t>
+        <w:t xml:space="preserve"> the suggested route (⭐) already shows camB_centre and camC_east.</w:t>
       </w:r>
     </w:p>
     <w:p>
@@ -545,12 +516,12 @@
         <w:spacing w:after="60"/>
       </w:pPr>
       <w:r>
-        <w:t>Honest talking point: this tracklet's middle crop on the search card shows a green car. The tracker briefly</w:t>
+        <w:t>Honest talking point: this track briefly switched between two cars (one crop is a green car); the crops are how a</w:t>
       </w:r>
     </w:p>
     <w:p>
       <w:r>
-        <w:t>switched identities between two cars; the evidence frame and the crops are how a reviewer spots that.</w:t>
+        <w:t>reviewer spots that.</w:t>
       </w:r>
     </w:p>
     <w:p>
@@ -576,7 +547,7 @@
         <w:t>white</w:t>
       </w:r>
       <w:r>
-        <w:t xml:space="preserve">, Vehicle type </w:t>
+        <w:t xml:space="preserve">, Type </w:t>
       </w:r>
       <w:r>
         <w:rPr>
@@ -585,21 +556,16 @@
         <w:t>sedan</w:t>
       </w:r>
       <w:r>
-        <w:t xml:space="preserve">; confirm </w:t>
+        <w:t xml:space="preserve">; select the silver Citroën in </w:t>
       </w:r>
       <w:r>
         <w:rPr>
           <w:b/>
         </w:rPr>
-        <w:t>camA_west · track 1</w:t>
+        <w:t>camA_west at 00:00.00–00:08.20</w:t>
       </w:r>
       <w:r>
-        <w:t xml:space="preserve"> (00:00.00–00:08.20, a silver</w:t>
-      </w:r>
-    </w:p>
-    <w:p>
-      <w:r>
-        <w:t>Citroën; it is around #9 in the list).</w:t>
+        <w:t xml:space="preserve"> (around #9).</w:t>
       </w:r>
     </w:p>
     <w:p>
@@ -608,13 +574,7 @@
         <w:spacing w:after="60"/>
       </w:pPr>
       <w:r>
-        <w:rPr>
-          <w:i/>
-        </w:rPr>
-        <w:t>Expect:</w:t>
-      </w:r>
-      <w:r>
-        <w:t xml:space="preserve"> the suggestion adds camB_centre track 25. Confirm it with </w:t>
+        <w:t xml:space="preserve">Confirm its ⭐ camB_centre sighting with </w:t>
       </w:r>
       <w:r>
         <w:rPr>
@@ -623,12 +583,7 @@
         <w:t>✓ Same vehicle</w:t>
       </w:r>
       <w:r>
-        <w:t>: the true camC_east sighting</w:t>
-      </w:r>
-    </w:p>
-    <w:p>
-      <w:r>
-        <w:t xml:space="preserve">(track 70) then moves to </w:t>
+        <w:t xml:space="preserve">: the true camC_east sighting then moves to </w:t>
       </w:r>
       <w:r>
         <w:rPr>
@@ -637,7 +592,7 @@
         <w:t>#1</w:t>
       </w:r>
       <w:r>
-        <w:t xml:space="preserve"> in the camC_east box.</w:t>
+        <w:t xml:space="preserve"> in its row.</w:t>
       </w:r>
     </w:p>
     <w:p>
@@ -646,12 +601,12 @@
         <w:spacing w:after="60"/>
       </w:pPr>
       <w:r>
-        <w:t>The camD_other_road box shows a similar white Citroën (track 14). It is on a different road, so it must not be</w:t>
+        <w:t>The camD_other_road row shows a similar white Citroën. It is on a different road, so it must not be confirmed. This is</w:t>
       </w:r>
     </w:p>
     <w:p>
       <w:r>
-        <w:t>confirmed. This is the failure case in the report (Figure 8): a look-alike is why the human confirms each hop.</w:t>
+        <w:t>the failure case in the report (Figure 8): a look-alike is why the human confirms each step.</w:t>
       </w:r>
     </w:p>
     <w:p>
@@ -668,7 +623,7 @@
         <w:spacing w:after="60"/>
       </w:pPr>
       <w:r>
-        <w:t>Stage 1 uses only the fields you fill in; a missing field is ignored rather than counted as a mismatch.</w:t>
+        <w:t>Step ① uses only the fields you fill in; a missing field is ignored rather than counted as a mismatch.</w:t>
       </w:r>
     </w:p>
     <w:p>
@@ -677,7 +632,7 @@
         <w:spacing w:after="60"/>
       </w:pPr>
       <w:r>
-        <w:t>The confirm step is deliberate: V-Trace never claims an identity on its own.</w:t>
+        <w:t>Selecting a vehicle is deliberate: V-Trace never claims an identity on its own.</w:t>
       </w:r>
     </w:p>
     <w:p>
@@ -686,7 +641,7 @@
         <w:spacing w:after="60"/>
       </w:pPr>
       <w:r>
-        <w:t xml:space="preserve">In tab 3, the traced path is built by scoring each remaining camera against </w:t>
+        <w:t xml:space="preserve">Each camera row is a ranked Re-ID result, scored against </w:t>
       </w:r>
       <w:r>
         <w:rPr>
@@ -695,12 +650,12 @@
         <w:t>every</w:t>
       </w:r>
       <w:r>
-        <w:t xml:space="preserve"> sighting already on the path,</w:t>
+        <w:t xml:space="preserve"> confirmed view of the vehicle, so the middle camera</w:t>
       </w:r>
     </w:p>
     <w:p>
       <w:r>
-        <w:t>so the middle camera bridges the far, small view and the near, large view.</w:t>
+        <w:t>bridges the far, small view and the near, large view.</w:t>
       </w:r>
     </w:p>
     <w:p>
@@ -709,39 +664,13 @@
         <w:spacing w:after="60"/>
       </w:pPr>
       <w:r>
-        <w:t xml:space="preserve">Each ranked candidate shows its eleven-number evidence vector and the evidence frame, so a reviewer can see </w:t>
-      </w:r>
-      <w:r>
-        <w:rPr>
-          <w:i/>
-        </w:rPr>
-        <w:t>why</w:t>
-      </w:r>
-      <w:r>
-        <w:t xml:space="preserve"> it</w:t>
-      </w:r>
-    </w:p>
-    <w:p>
-      <w:r>
-        <w:t>was ranked there.</w:t>
-      </w:r>
-    </w:p>
-    <w:p>
-      <w:pPr>
-        <w:pStyle w:val="ListBullet"/>
-        <w:spacing w:after="60"/>
-      </w:pPr>
-      <w:r>
-        <w:t xml:space="preserve">Switch the matcher to </w:t>
-      </w:r>
-      <w:r>
         <w:rPr>
           <w:b/>
         </w:rPr>
-        <w:t>appearance only</w:t>
+        <w:t>Analysis</w:t>
       </w:r>
       <w:r>
-        <w:t xml:space="preserve"> to show the fused evidence doing better on the same query.</w:t>
+        <w:t xml:space="preserve"> page: the VeRi-776 benchmark results, the vehicle map (SOM) and the tracking check.</w:t>
       </w:r>
     </w:p>
     <w:p>
@@ -852,7 +781,7 @@
               <w:rPr>
                 <w:sz w:val="19"/>
               </w:rPr>
-              <w:t>tab 2</w:t>
+              <w:t>Search ①</w:t>
             </w:r>
           </w:p>
         </w:tc>
@@ -868,7 +797,7 @@
               <w:rPr>
                 <w:sz w:val="19"/>
               </w:rPr>
-              <w:t>each extra cue narrows the candidate list</w:t>
+              <w:t>each extra cue narrows the list</w:t>
             </w:r>
           </w:p>
         </w:tc>
@@ -912,7 +841,7 @@
               <w:rPr>
                 <w:sz w:val="19"/>
               </w:rPr>
-              <w:t>tab 2</w:t>
+              <w:t>Search ①</w:t>
             </w:r>
           </w:p>
         </w:tc>
@@ -929,7 +858,7 @@
               <w:rPr>
                 <w:sz w:val="19"/>
               </w:rPr>
-              <w:t>wildcard plate matching (plates are rarely readable in the demo footage, so unread plates get a neutral score instead of being excluded)</w:t>
+              <w:t>wildcard plate matching (plates are rarely readable in the demo footage, so unread plates get a neutral score)</w:t>
             </w:r>
           </w:p>
         </w:tc>
@@ -945,9 +874,16 @@
             </w:pPr>
             <w:r>
               <w:rPr>
+                <w:b/>
                 <w:sz w:val="19"/>
               </w:rPr>
-              <w:t>Add a distinctive cue or free text, e.g. "bus" or "car with a roof rack"</w:t>
+              <w:t>More detail</w:t>
+            </w:r>
+            <w:r>
+              <w:rPr>
+                <w:sz w:val="19"/>
+              </w:rPr>
+              <w:t xml:space="preserve"> → a distinctive feature or free text, e.g. "bus"</w:t>
             </w:r>
           </w:p>
         </w:tc>
@@ -963,7 +899,7 @@
               <w:rPr>
                 <w:sz w:val="19"/>
               </w:rPr>
-              <w:t>tab 2</w:t>
+              <w:t>Search ①</w:t>
             </w:r>
           </w:p>
         </w:tc>
@@ -998,7 +934,7 @@
               <w:rPr>
                 <w:sz w:val="19"/>
               </w:rPr>
-              <w:t>Confirm a car, then change the matcher (appearance only / weighted fusion / Random Forest)</w:t>
+              <w:t>Pick a vehicle from a camera instead of describing it</w:t>
             </w:r>
           </w:p>
         </w:tc>
@@ -1015,7 +951,7 @@
               <w:rPr>
                 <w:sz w:val="19"/>
               </w:rPr>
-              <w:t>tab 3</w:t>
+              <w:t>Search ①</w:t>
             </w:r>
           </w:p>
         </w:tc>
@@ -1032,7 +968,7 @@
               <w:rPr>
                 <w:sz w:val="19"/>
               </w:rPr>
-              <w:t>how the fused evidence changes the ranking</w:t>
+              <w:t>vehicle-to-vehicle Re-ID from any query</w:t>
             </w:r>
           </w:p>
         </w:tc>
@@ -1050,7 +986,33 @@
               <w:rPr>
                 <w:sz w:val="19"/>
               </w:rPr>
-              <w:t>Raise the minimum match score, or untick "Cameras share a clock"</w:t>
+              <w:t xml:space="preserve">Change </w:t>
+            </w:r>
+            <w:r>
+              <w:rPr>
+                <w:b/>
+                <w:sz w:val="19"/>
+              </w:rPr>
+              <w:t>Matcher</w:t>
+            </w:r>
+            <w:r>
+              <w:rPr>
+                <w:sz w:val="19"/>
+              </w:rPr>
+              <w:t xml:space="preserve"> in </w:t>
+            </w:r>
+            <w:r>
+              <w:rPr>
+                <w:i/>
+                <w:sz w:val="19"/>
+              </w:rPr>
+              <w:t>Matching settings</w:t>
+            </w:r>
+            <w:r>
+              <w:rPr>
+                <w:sz w:val="19"/>
+              </w:rPr>
+              <w:t xml:space="preserve"> (sidebar)</w:t>
             </w:r>
           </w:p>
         </w:tc>
@@ -1066,7 +1028,7 @@
               <w:rPr>
                 <w:sz w:val="19"/>
               </w:rPr>
-              <w:t>tab 3</w:t>
+              <w:t>Search ③</w:t>
             </w:r>
           </w:p>
         </w:tc>
@@ -1082,7 +1044,7 @@
               <w:rPr>
                 <w:sz w:val="19"/>
               </w:rPr>
-              <w:t>how strict path tracing is; the time window rejects impossible jumps</w:t>
+              <w:t>appearance only vs learned metric vs fused evidence</w:t>
             </w:r>
           </w:p>
         </w:tc>
@@ -1101,7 +1063,14 @@
               <w:rPr>
                 <w:sz w:val="19"/>
               </w:rPr>
-              <w:t>Tick "SOM candidate pre-filter"</w:t>
+              <w:t xml:space="preserve">Untick </w:t>
+            </w:r>
+            <w:r>
+              <w:rPr>
+                <w:i/>
+                <w:sz w:val="19"/>
+              </w:rPr>
+              <w:t>Cameras share a clock</w:t>
             </w:r>
           </w:p>
         </w:tc>
@@ -1118,7 +1087,7 @@
               <w:rPr>
                 <w:sz w:val="19"/>
               </w:rPr>
-              <w:t>tab 3</w:t>
+              <w:t>sidebar</w:t>
             </w:r>
           </w:p>
         </w:tc>
@@ -1135,7 +1104,7 @@
               <w:rPr>
                 <w:sz w:val="19"/>
               </w:rPr>
-              <w:t>the unsupervised pre-filter (it speeds up search but can drop true matches, as the report discusses)</w:t>
+              <w:t>the time window that rejects impossible jumps</w:t>
             </w:r>
           </w:p>
         </w:tc>
@@ -1151,9 +1120,16 @@
             </w:pPr>
             <w:r>
               <w:rPr>
+                <w:i/>
                 <w:sz w:val="19"/>
               </w:rPr>
-              <w:t>Upload your own two short traffic clips (10–30 s each)</w:t>
+              <w:t>Use your own videos</w:t>
+            </w:r>
+            <w:r>
+              <w:rPr>
+                <w:sz w:val="19"/>
+              </w:rPr>
+              <w:t xml:space="preserve"> (sidebar): two short traffic clips, Fast processing on</w:t>
             </w:r>
           </w:p>
         </w:tc>
@@ -1169,7 +1145,7 @@
               <w:rPr>
                 <w:sz w:val="19"/>
               </w:rPr>
-              <w:t>tab 1</w:t>
+              <w:t>sidebar</w:t>
             </w:r>
           </w:p>
         </w:tc>
@@ -1185,20 +1161,7 @@
               <w:rPr>
                 <w:sz w:val="19"/>
               </w:rPr>
-              <w:t xml:space="preserve">the full pipeline on new footage; use the </w:t>
-            </w:r>
-            <w:r>
-              <w:rPr>
-                <w:b/>
-                <w:sz w:val="19"/>
-              </w:rPr>
-              <w:t>Fast</w:t>
-            </w:r>
-            <w:r>
-              <w:rPr>
-                <w:sz w:val="19"/>
-              </w:rPr>
-              <w:t xml:space="preserve"> preset on the hosted app</w:t>
+              <w:t>the full pipeline on new footage</w:t>
             </w:r>
           </w:p>
         </w:tc>
@@ -1217,7 +1180,20 @@
               <w:rPr>
                 <w:sz w:val="19"/>
               </w:rPr>
-              <w:t>Open the Track review, SOM and Evaluation tabs</w:t>
+              <w:t xml:space="preserve">Open the </w:t>
+            </w:r>
+            <w:r>
+              <w:rPr>
+                <w:b/>
+                <w:sz w:val="19"/>
+              </w:rPr>
+              <w:t>Analysis</w:t>
+            </w:r>
+            <w:r>
+              <w:rPr>
+                <w:sz w:val="19"/>
+              </w:rPr>
+              <w:t xml:space="preserve"> page</w:t>
             </w:r>
           </w:p>
         </w:tc>
@@ -1234,7 +1210,7 @@
               <w:rPr>
                 <w:sz w:val="19"/>
               </w:rPr>
-              <w:t>tabs 4–6</w:t>
+              <w:t>sidebar</w:t>
             </w:r>
           </w:p>
         </w:tc>
@@ -1251,7 +1227,7 @@
               <w:rPr>
                 <w:sz w:val="19"/>
               </w:rPr>
-              <w:t>manual tracking check, the unsupervised map, and the VeRi-776 benchmark results</w:t>
+              <w:t>benchmark results, SOM vehicle map, tracking check</w:t>
             </w:r>
           </w:p>
         </w:tc>
@@ -1270,7 +1246,7 @@
         <w:t>Known limitations to keep in mind:</w:t>
       </w:r>
       <w:r>
-        <w:t xml:space="preserve"> plates are not readable at this camera distance; colour labels are unreliable for silver/grey cars; a car seen very small in one camera may not reach the minimum score, so its path can stop early; results are ranked candidates for human review, never identity claims.</w:t>
+        <w:t xml:space="preserve"> plates are not readable at this camera distance; colour labels are unreliable for silver/grey cars; a car seen very small in one camera may rank lower there; results are ranked candidates for human review, never identity claims.</w:t>
       </w:r>
     </w:p>
     <w:sectPr>

</xml_diff>

<commit_message>
VeRi-776 benchmark of the pretrained model; rebuilt deck, reports, screenshots
- results/veri_eval.json: official split, Rank-1 97.0%, mAP 81.6% (FastReID reports 97.0 / 81.9)
- Final presentation (14 slides), final/individual reports and demo guide regenerated

Co-Authored-By: Claude Opus 5.5 <noreply@anthropic.com>
</commit_message>
<xml_diff>
--- a/deliverables/V-Trace_Demo_Guide.docx
+++ b/deliverables/V-Trace_Demo_Guide.docx
@@ -167,7 +167,7 @@
         <w:rPr>
           <w:b/>
         </w:rPr>
-        <w:t>Analysis</w:t>
+        <w:t>How it works</w:t>
       </w:r>
       <w:r>
         <w:t>. It opens in dark mode; switch with ⋮ (top right) → Settings → Theme.</w:t>
@@ -186,10 +186,19 @@
         <w:rPr>
           <w:b/>
         </w:rPr>
-        <w:t>The cameras</w:t>
+        <w:t>The videos</w:t>
       </w:r>
       <w:r>
-        <w:t xml:space="preserve"> (listed in the sidebar). </w:t>
+        <w:t xml:space="preserve"> (sidebar → </w:t>
+      </w:r>
+      <w:r>
+        <w:rPr>
+          <w:i/>
+        </w:rPr>
+        <w:t>Demo videos</w:t>
+      </w:r>
+      <w:r>
+        <w:t xml:space="preserve">, already processed). </w:t>
       </w:r>
       <w:r>
         <w:rPr>
@@ -233,7 +242,7 @@
         <w:t>camD_other_road</w:t>
       </w:r>
       <w:r>
-        <w:t xml:space="preserve"> is a different road whose vehicles never appear in A–C, so it should never be confirmed.</w:t>
+        <w:t xml:space="preserve"> is a different road whose vehicles never appear in A–C.</w:t>
       </w:r>
     </w:p>
     <w:p>
@@ -244,7 +253,7 @@
         <w:rPr>
           <w:b/>
         </w:rPr>
-        <w:t>① Find the vehicle</w:t>
+        <w:t>1 Describe the vehicle</w:t>
       </w:r>
       <w:r>
         <w:t xml:space="preserve">, </w:t>
@@ -253,7 +262,7 @@
         <w:rPr>
           <w:b/>
         </w:rPr>
-        <w:t>② Its route across the cameras</w:t>
+        <w:t>2 Best matches</w:t>
       </w:r>
       <w:r>
         <w:t xml:space="preserve">, </w:t>
@@ -262,7 +271,10 @@
         <w:rPr>
           <w:b/>
         </w:rPr>
-        <w:t>③ Where else was it seen?</w:t>
+        <w:t>3 Where this vehicle was seen</w:t>
+      </w:r>
+      <w:r>
+        <w:t>.</w:t>
       </w:r>
     </w:p>
     <w:p>
@@ -270,7 +282,7 @@
         <w:rPr>
           <w:b/>
         </w:rPr>
-        <w:t>Scenario A – trace a car through three cameras (main demo, about 2 minutes)</w:t>
+        <w:t>Scenario A – find a red car and trace it through three cameras (main demo)</w:t>
       </w:r>
     </w:p>
     <w:p>
@@ -282,7 +294,7 @@
         <w:rPr>
           <w:b/>
         </w:rPr>
-        <w:t>① Find the vehicle → Describe it</w:t>
+        <w:t>1 Describe the vehicle</w:t>
       </w:r>
       <w:r>
         <w:t xml:space="preserve">: Colour </w:t>
@@ -300,7 +312,7 @@
         <w:rPr>
           <w:b/>
         </w:rPr>
-        <w:t>sedan</w:t>
+        <w:t>suv</w:t>
       </w:r>
       <w:r>
         <w:t xml:space="preserve">, click </w:t>
@@ -316,32 +328,27 @@
       </w:r>
     </w:p>
     <w:p>
+      <w:pPr>
+        <w:pStyle w:val="ListNumber"/>
+        <w:spacing w:after="60"/>
+      </w:pPr>
       <w:r>
         <w:rPr>
-          <w:i/>
+          <w:b/>
         </w:rPr>
-        <w:t>Expect:</w:t>
+        <w:t>2 Best matches</w:t>
       </w:r>
       <w:r>
-        <w:t xml:space="preserve"> #1 is a red Citroën in </w:t>
+        <w:t xml:space="preserve">: #3 is a red Citroën in </w:t>
       </w:r>
       <w:r>
         <w:rPr>
           <w:b/>
         </w:rPr>
-        <w:t>camA_west, 00:40.80–00:42.24</w:t>
+        <w:t>camB_centre, 00:42.00 – 00:43.56</w:t>
       </w:r>
       <w:r>
-        <w:t>.</w:t>
-      </w:r>
-    </w:p>
-    <w:p>
-      <w:pPr>
-        <w:pStyle w:val="ListNumber"/>
-        <w:spacing w:after="60"/>
-      </w:pPr>
-      <w:r>
-        <w:t xml:space="preserve">Click </w:t>
+        <w:t xml:space="preserve">. Click </w:t>
       </w:r>
       <w:r>
         <w:rPr>
@@ -350,65 +357,7 @@
         <w:t>Select</w:t>
       </w:r>
       <w:r>
-        <w:t xml:space="preserve"> on it.</w:t>
-      </w:r>
-    </w:p>
-    <w:p>
-      <w:pPr>
-        <w:pStyle w:val="ListNumber"/>
-        <w:spacing w:after="60"/>
-      </w:pPr>
-      <w:r>
-        <w:rPr>
-          <w:b/>
-        </w:rPr>
-        <w:t>③ Where else was it seen?</w:t>
-      </w:r>
-      <w:r>
-        <w:t xml:space="preserve"> In the camB_centre row, the ⭐ #1 match is the same car (00:42.00–00:43.56).</w:t>
-      </w:r>
-    </w:p>
-    <w:p>
-      <w:r>
-        <w:t xml:space="preserve">Click </w:t>
-      </w:r>
-      <w:r>
-        <w:rPr>
-          <w:b/>
-        </w:rPr>
-        <w:t>✓ Same vehicle</w:t>
-      </w:r>
-      <w:r>
         <w:t>.</w:t>
-      </w:r>
-    </w:p>
-    <w:p>
-      <w:pPr>
-        <w:pStyle w:val="ListNumber"/>
-        <w:spacing w:after="60"/>
-      </w:pPr>
-      <w:r>
-        <w:t xml:space="preserve">The camC_east row is re-scored against both confirmed views. Click </w:t>
-      </w:r>
-      <w:r>
-        <w:rPr>
-          <w:b/>
-        </w:rPr>
-        <w:t>✓ Same vehicle</w:t>
-      </w:r>
-      <w:r>
-        <w:t xml:space="preserve"> on the red Citroën at</w:t>
-      </w:r>
-    </w:p>
-    <w:p>
-      <w:r>
-        <w:rPr>
-          <w:b/>
-        </w:rPr>
-        <w:t>00:43.56–00:44.16</w:t>
-      </w:r>
-      <w:r>
-        <w:t xml:space="preserve"> (among the four shown).</w:t>
       </w:r>
     </w:p>
     <w:p>
@@ -429,24 +378,10 @@
         <w:rPr>
           <w:b/>
         </w:rPr>
-        <w:t>② Its route across the cameras</w:t>
+        <w:t>3 Where this vehicle was seen</w:t>
       </w:r>
       <w:r>
-        <w:t xml:space="preserve"> shows camA 0:40.8 → camB 0:42.0 → camC 0:43.6, all confirmed.</w:t>
-      </w:r>
-    </w:p>
-    <w:p>
-      <w:r>
-        <w:t xml:space="preserve">Open </w:t>
-      </w:r>
-      <w:r>
-        <w:rPr>
-          <w:b/>
-        </w:rPr>
-        <w:t>Why these matches?</w:t>
-      </w:r>
-      <w:r>
-        <w:t xml:space="preserve"> to show the evidence behind each candidate.</w:t>
+        <w:t xml:space="preserve"> shows</w:t>
       </w:r>
     </w:p>
     <w:p>
@@ -454,7 +389,36 @@
         <w:rPr>
           <w:b/>
         </w:rPr>
-        <w:t>Scenario B – pick a vehicle straight from the footage</w:t>
+        <w:t>Route: camA_west (00:40.80) → camB_centre (00:42.00) → camC_east (00:43.56)</w:t>
+      </w:r>
+      <w:r>
+        <w:t xml:space="preserve">, with one row per camera: the time span, a crop and the full frame with the car boxed. camA scores 0.67 and camC 0.51. </w:t>
+      </w:r>
+      <w:r>
+        <w:rPr>
+          <w:b/>
+        </w:rPr>
+        <w:t>camD_other_road</w:t>
+      </w:r>
+      <w:r>
+        <w:t xml:space="preserve"> is listed under </w:t>
+      </w:r>
+      <w:r>
+        <w:rPr>
+          <w:i/>
+        </w:rPr>
+        <w:t>Not seen in</w:t>
+      </w:r>
+      <w:r>
+        <w:t xml:space="preserve"> ("no vehicle in the time window").</w:t>
+      </w:r>
+    </w:p>
+    <w:p>
+      <w:r>
+        <w:rPr>
+          <w:b/>
+        </w:rPr>
+        <w:t>Scenario B – the same search, an ambiguous result</w:t>
       </w:r>
     </w:p>
     <w:p>
@@ -463,36 +427,16 @@
         <w:spacing w:after="60"/>
       </w:pPr>
       <w:r>
-        <w:rPr>
-          <w:b/>
-        </w:rPr>
-        <w:t>① Find the vehicle → Pick it from a camera</w:t>
-      </w:r>
-      <w:r>
-        <w:t xml:space="preserve">, camera </w:t>
+        <w:t xml:space="preserve">In the same results, select #2 (the same red Citroën in </w:t>
       </w:r>
       <w:r>
         <w:rPr>
           <w:b/>
         </w:rPr>
-        <w:t>camA_west</w:t>
+        <w:t>camA_west, 00:40.80</w:t>
       </w:r>
       <w:r>
-        <w:t>: every vehicle in that camera, in order of</w:t>
-      </w:r>
-    </w:p>
-    <w:p>
-      <w:r>
-        <w:t xml:space="preserve">appearance. Select the red car at </w:t>
-      </w:r>
-      <w:r>
-        <w:rPr>
-          <w:b/>
-        </w:rPr>
-        <w:t>00:00.96–00:06.72</w:t>
-      </w:r>
-      <w:r>
-        <w:t>.</w:t>
+        <w:t>).</w:t>
       </w:r>
     </w:p>
     <w:p>
@@ -507,7 +451,29 @@
         <w:t>Expect:</w:t>
       </w:r>
       <w:r>
-        <w:t xml:space="preserve"> the suggested route (⭐) already shows camB_centre and camC_east.</w:t>
+        <w:t xml:space="preserve"> camB_centre and camC_east are listed under </w:t>
+      </w:r>
+      <w:r>
+        <w:rPr>
+          <w:i/>
+        </w:rPr>
+        <w:t>Not seen in</w:t>
+      </w:r>
+      <w:r>
+        <w:t>, each with its three closest vehicles. In camB the</w:t>
+      </w:r>
+    </w:p>
+    <w:p>
+      <w:r>
+        <w:t>true car (00:42.00) is first with 0.67, but another red car (00:39.96) scores 0.62, too close to call, so the ratio test leaves the choice to the user. Good talking point: the system shows evidence, it does not claim an identity. (Searching from the camB sighting, as in Scenario A, gives a clear answer because camB's view of the car is sharper.)</w:t>
+      </w:r>
+    </w:p>
+    <w:p>
+      <w:r>
+        <w:rPr>
+          <w:b/>
+        </w:rPr>
+        <w:t>Scenario C – upload videos</w:t>
       </w:r>
     </w:p>
     <w:p>
@@ -516,12 +482,25 @@
         <w:spacing w:after="60"/>
       </w:pPr>
       <w:r>
-        <w:t>Honest talking point: this track briefly switched between two cars (one crop is a green car); the crops are how a</w:t>
+        <w:t xml:space="preserve">Sidebar → </w:t>
       </w:r>
-    </w:p>
-    <w:p>
       <w:r>
-        <w:t>reviewer spots that.</w:t>
+        <w:rPr>
+          <w:b/>
+        </w:rPr>
+        <w:t>Upload new videos</w:t>
+      </w:r>
+      <w:r>
+        <w:t xml:space="preserve">, add two or three short clips (10–30 s), keep </w:t>
+      </w:r>
+      <w:r>
+        <w:rPr>
+          <w:b/>
+        </w:rPr>
+        <w:t>Fast processing</w:t>
+      </w:r>
+      <w:r>
+        <w:t xml:space="preserve"> on, click</w:t>
       </w:r>
     </w:p>
     <w:p>
@@ -529,84 +508,10 @@
         <w:rPr>
           <w:b/>
         </w:rPr>
-        <w:t>Scenario C – confirming one camera fixes the next (and ignoring a look-alike)</w:t>
-      </w:r>
-    </w:p>
-    <w:p>
-      <w:pPr>
-        <w:pStyle w:val="ListBullet"/>
-        <w:spacing w:after="60"/>
-      </w:pPr>
-      <w:r>
-        <w:t xml:space="preserve">Search Colour </w:t>
+        <w:t>Process videos</w:t>
       </w:r>
       <w:r>
-        <w:rPr>
-          <w:b/>
-        </w:rPr>
-        <w:t>white</w:t>
-      </w:r>
-      <w:r>
-        <w:t xml:space="preserve">, Type </w:t>
-      </w:r>
-      <w:r>
-        <w:rPr>
-          <w:b/>
-        </w:rPr>
-        <w:t>sedan</w:t>
-      </w:r>
-      <w:r>
-        <w:t xml:space="preserve">; select the silver Citroën in </w:t>
-      </w:r>
-      <w:r>
-        <w:rPr>
-          <w:b/>
-        </w:rPr>
-        <w:t>camA_west at 00:00.00–00:08.20</w:t>
-      </w:r>
-      <w:r>
-        <w:t xml:space="preserve"> (around #9).</w:t>
-      </w:r>
-    </w:p>
-    <w:p>
-      <w:pPr>
-        <w:pStyle w:val="ListBullet"/>
-        <w:spacing w:after="60"/>
-      </w:pPr>
-      <w:r>
-        <w:t xml:space="preserve">Confirm its ⭐ camB_centre sighting with </w:t>
-      </w:r>
-      <w:r>
-        <w:rPr>
-          <w:b/>
-        </w:rPr>
-        <w:t>✓ Same vehicle</w:t>
-      </w:r>
-      <w:r>
-        <w:t xml:space="preserve">: the true camC_east sighting then moves to </w:t>
-      </w:r>
-      <w:r>
-        <w:rPr>
-          <w:b/>
-        </w:rPr>
-        <w:t>#1</w:t>
-      </w:r>
-      <w:r>
-        <w:t xml:space="preserve"> in its row.</w:t>
-      </w:r>
-    </w:p>
-    <w:p>
-      <w:pPr>
-        <w:pStyle w:val="ListBullet"/>
-        <w:spacing w:after="60"/>
-      </w:pPr>
-      <w:r>
-        <w:t>The camD_other_road row shows a similar white Citroën. It is on a different road, so it must not be confirmed. This is</w:t>
-      </w:r>
-    </w:p>
-    <w:p>
-      <w:r>
-        <w:t>the failure case in the report (Figure 8): a look-alike is why the human confirms each step.</w:t>
+        <w:t>. Each clip becomes one camera; describe and select a vehicle as above. Uploaded videos are assumed to be recorded at different times, so the time window is off (Settings).</w:t>
       </w:r>
     </w:p>
     <w:p>
@@ -623,7 +528,12 @@
         <w:spacing w:after="60"/>
       </w:pPr>
       <w:r>
-        <w:t>Step ① uses only the fields you fill in; a missing field is ignored rather than counted as a mismatch.</w:t>
+        <w:t>Every model is pretrained and used as published: YOLO11 + ByteTrack (sightings), CLIP zero-shot (description),</w:t>
+      </w:r>
+    </w:p>
+    <w:p>
+      <w:r>
+        <w:t>EasyOCR (plates), and the FastReID VeRi-776 Re-ID model from the VeRi authors' team (same vehicle across cameras).</w:t>
       </w:r>
     </w:p>
     <w:p>
@@ -632,7 +542,7 @@
         <w:spacing w:after="60"/>
       </w:pPr>
       <w:r>
-        <w:t>Selecting a vehicle is deliberate: V-Trace never claims an identity on its own.</w:t>
+        <w:t>A sighting = all frames in which one vehicle is seen continuously in one camera.</w:t>
       </w:r>
     </w:p>
     <w:p>
@@ -641,21 +551,21 @@
         <w:spacing w:after="60"/>
       </w:pPr>
       <w:r>
-        <w:t xml:space="preserve">Each camera row is a ranked Re-ID result, scored against </w:t>
+        <w:t>Step 1 uses only the fields you fill in; a missing field is ignored rather than counted as a mismatch.</w:t>
       </w:r>
+    </w:p>
+    <w:p>
+      <w:pPr>
+        <w:pStyle w:val="ListBullet"/>
+        <w:spacing w:after="60"/>
+      </w:pPr>
       <w:r>
-        <w:rPr>
-          <w:i/>
-        </w:rPr>
-        <w:t>every</w:t>
-      </w:r>
-      <w:r>
-        <w:t xml:space="preserve"> confirmed view of the vehicle, so the middle camera</w:t>
+        <w:t>A camera counts as "seen" only when its best sighting is similar enough (≥ 0.40) and clearly better than the</w:t>
       </w:r>
     </w:p>
     <w:p>
       <w:r>
-        <w:t>bridges the far, small view and the near, large view.</w:t>
+        <w:t>next one; for demo videos it must also be within 10 s.</w:t>
       </w:r>
     </w:p>
     <w:p>
@@ -667,10 +577,10 @@
         <w:rPr>
           <w:b/>
         </w:rPr>
-        <w:t>Analysis</w:t>
+        <w:t>How it works</w:t>
       </w:r>
       <w:r>
-        <w:t xml:space="preserve"> page: the VeRi-776 benchmark results, the vehicle map (SOM) and the tracking check.</w:t>
+        <w:t xml:space="preserve"> page: the models and the VeRi-776 benchmark numbers.</w:t>
       </w:r>
     </w:p>
     <w:p>
@@ -781,7 +691,7 @@
               <w:rPr>
                 <w:sz w:val="19"/>
               </w:rPr>
-              <w:t>Search ①</w:t>
+              <w:t>Search 1</w:t>
             </w:r>
           </w:p>
         </w:tc>
@@ -797,7 +707,7 @@
               <w:rPr>
                 <w:sz w:val="19"/>
               </w:rPr>
-              <w:t>each extra cue narrows the list</w:t>
+              <w:t>each extra field narrows the list</w:t>
             </w:r>
           </w:p>
         </w:tc>
@@ -841,7 +751,7 @@
               <w:rPr>
                 <w:sz w:val="19"/>
               </w:rPr>
-              <w:t>Search ①</w:t>
+              <w:t>Search 1</w:t>
             </w:r>
           </w:p>
         </w:tc>
@@ -874,16 +784,9 @@
             </w:pPr>
             <w:r>
               <w:rPr>
-                <w:b/>
                 <w:sz w:val="19"/>
               </w:rPr>
-              <w:t>More detail</w:t>
-            </w:r>
-            <w:r>
-              <w:rPr>
-                <w:sz w:val="19"/>
-              </w:rPr>
-              <w:t xml:space="preserve"> → a distinctive feature or free text, e.g. "bus"</w:t>
+              <w:t>Pick a distinctive feature or type free text, e.g. "bus"</w:t>
             </w:r>
           </w:p>
         </w:tc>
@@ -899,7 +802,7 @@
               <w:rPr>
                 <w:sz w:val="19"/>
               </w:rPr>
-              <w:t>Search ①</w:t>
+              <w:t>Search 1</w:t>
             </w:r>
           </w:p>
         </w:tc>
@@ -934,7 +837,7 @@
               <w:rPr>
                 <w:sz w:val="19"/>
               </w:rPr>
-              <w:t>Pick a vehicle from a camera instead of describing it</w:t>
+              <w:t>Select different vehicles from the results</w:t>
             </w:r>
           </w:p>
         </w:tc>
@@ -951,7 +854,7 @@
               <w:rPr>
                 <w:sz w:val="19"/>
               </w:rPr>
-              <w:t>Search ①</w:t>
+              <w:t>Search 3</w:t>
             </w:r>
           </w:p>
         </w:tc>
@@ -968,7 +871,7 @@
               <w:rPr>
                 <w:sz w:val="19"/>
               </w:rPr>
-              <w:t>vehicle-to-vehicle Re-ID from any query</w:t>
+              <w:t>per-camera sightings, or the closest candidates when there is no confident match</w:t>
             </w:r>
           </w:p>
         </w:tc>
@@ -986,33 +889,14 @@
               <w:rPr>
                 <w:sz w:val="19"/>
               </w:rPr>
-              <w:t xml:space="preserve">Change </w:t>
-            </w:r>
-            <w:r>
-              <w:rPr>
-                <w:b/>
-                <w:sz w:val="19"/>
-              </w:rPr>
-              <w:t>Matcher</w:t>
-            </w:r>
-            <w:r>
-              <w:rPr>
-                <w:sz w:val="19"/>
-              </w:rPr>
-              <w:t xml:space="preserve"> in </w:t>
+              <w:t xml:space="preserve">Change the threshold or turn off </w:t>
             </w:r>
             <w:r>
               <w:rPr>
                 <w:i/>
                 <w:sz w:val="19"/>
               </w:rPr>
-              <w:t>Matching settings</w:t>
-            </w:r>
-            <w:r>
-              <w:rPr>
-                <w:sz w:val="19"/>
-              </w:rPr>
-              <w:t xml:space="preserve"> (sidebar)</w:t>
+              <w:t>Videos were recorded at the same time</w:t>
             </w:r>
           </w:p>
         </w:tc>
@@ -1028,7 +912,7 @@
               <w:rPr>
                 <w:sz w:val="19"/>
               </w:rPr>
-              <w:t>Search ③</w:t>
+              <w:t>sidebar → Settings</w:t>
             </w:r>
           </w:p>
         </w:tc>
@@ -1044,7 +928,7 @@
               <w:rPr>
                 <w:sz w:val="19"/>
               </w:rPr>
-              <w:t>appearance only vs learned metric vs fused evidence</w:t>
+              <w:t>stricter / looser matching; the time window</w:t>
             </w:r>
           </w:p>
         </w:tc>
@@ -1061,16 +945,10 @@
             </w:pPr>
             <w:r>
               <w:rPr>
-                <w:sz w:val="19"/>
-              </w:rPr>
-              <w:t xml:space="preserve">Untick </w:t>
-            </w:r>
-            <w:r>
-              <w:rPr>
                 <w:i/>
                 <w:sz w:val="19"/>
               </w:rPr>
-              <w:t>Cameras share a clock</w:t>
+              <w:t>Upload new videos</w:t>
             </w:r>
           </w:p>
         </w:tc>
@@ -1104,130 +982,7 @@
               <w:rPr>
                 <w:sz w:val="19"/>
               </w:rPr>
-              <w:t>the time window that rejects impossible jumps</w:t>
-            </w:r>
-          </w:p>
-        </w:tc>
-      </w:tr>
-      <w:tr>
-        <w:tc>
-          <w:tcPr>
-            <w:tcW w:type="dxa" w:w="3137"/>
-          </w:tcPr>
-          <w:p>
-            <w:pPr>
-              <w:spacing w:after="0"/>
-            </w:pPr>
-            <w:r>
-              <w:rPr>
-                <w:i/>
-                <w:sz w:val="19"/>
-              </w:rPr>
-              <w:t>Use your own videos</w:t>
-            </w:r>
-            <w:r>
-              <w:rPr>
-                <w:sz w:val="19"/>
-              </w:rPr>
-              <w:t xml:space="preserve"> (sidebar): two short traffic clips, Fast processing on</w:t>
-            </w:r>
-          </w:p>
-        </w:tc>
-        <w:tc>
-          <w:tcPr>
-            <w:tcW w:type="dxa" w:w="3137"/>
-          </w:tcPr>
-          <w:p>
-            <w:pPr>
-              <w:spacing w:after="0"/>
-            </w:pPr>
-            <w:r>
-              <w:rPr>
-                <w:sz w:val="19"/>
-              </w:rPr>
-              <w:t>sidebar</w:t>
-            </w:r>
-          </w:p>
-        </w:tc>
-        <w:tc>
-          <w:tcPr>
-            <w:tcW w:type="dxa" w:w="3137"/>
-          </w:tcPr>
-          <w:p>
-            <w:pPr>
-              <w:spacing w:after="0"/>
-            </w:pPr>
-            <w:r>
-              <w:rPr>
-                <w:sz w:val="19"/>
-              </w:rPr>
               <w:t>the full pipeline on new footage</w:t>
-            </w:r>
-          </w:p>
-        </w:tc>
-      </w:tr>
-      <w:tr>
-        <w:tc>
-          <w:tcPr>
-            <w:tcW w:type="dxa" w:w="3137"/>
-            <w:shd w:val="clear" w:color="auto" w:fill="EAF7F6"/>
-          </w:tcPr>
-          <w:p>
-            <w:pPr>
-              <w:spacing w:after="0"/>
-            </w:pPr>
-            <w:r>
-              <w:rPr>
-                <w:sz w:val="19"/>
-              </w:rPr>
-              <w:t xml:space="preserve">Open the </w:t>
-            </w:r>
-            <w:r>
-              <w:rPr>
-                <w:b/>
-                <w:sz w:val="19"/>
-              </w:rPr>
-              <w:t>Analysis</w:t>
-            </w:r>
-            <w:r>
-              <w:rPr>
-                <w:sz w:val="19"/>
-              </w:rPr>
-              <w:t xml:space="preserve"> page</w:t>
-            </w:r>
-          </w:p>
-        </w:tc>
-        <w:tc>
-          <w:tcPr>
-            <w:tcW w:type="dxa" w:w="3137"/>
-            <w:shd w:val="clear" w:color="auto" w:fill="EAF7F6"/>
-          </w:tcPr>
-          <w:p>
-            <w:pPr>
-              <w:spacing w:after="0"/>
-            </w:pPr>
-            <w:r>
-              <w:rPr>
-                <w:sz w:val="19"/>
-              </w:rPr>
-              <w:t>sidebar</w:t>
-            </w:r>
-          </w:p>
-        </w:tc>
-        <w:tc>
-          <w:tcPr>
-            <w:tcW w:type="dxa" w:w="3137"/>
-            <w:shd w:val="clear" w:color="auto" w:fill="EAF7F6"/>
-          </w:tcPr>
-          <w:p>
-            <w:pPr>
-              <w:spacing w:after="0"/>
-            </w:pPr>
-            <w:r>
-              <w:rPr>
-                <w:sz w:val="19"/>
-              </w:rPr>
-              <w:t>benchmark results, SOM vehicle map, tracking check</w:t>
             </w:r>
           </w:p>
         </w:tc>
@@ -1246,7 +1001,7 @@
         <w:t>Known limitations to keep in mind:</w:t>
       </w:r>
       <w:r>
-        <w:t xml:space="preserve"> plates are not readable at this camera distance; colour labels are unreliable for silver/grey cars; a car seen very small in one camera may rank lower there; results are ranked candidates for human review, never identity claims.</w:t>
+        <w:t xml:space="preserve"> plates are not readable at this camera distance; colour labels are unreliable for silver/grey cars; a car seen very small or from a very different angle may not be matched; results are ranked candidates for human review, never identity claims.</w:t>
       </w:r>
     </w:p>
     <w:sectPr>

</xml_diff>

<commit_message>
Real-world camera details: location + recording start for every camera
- vtrace/cameras.py: a sighting's real-world time = camera recording start + position in the video;
  curated details for the demo cameras (camA-C one street/same clock, camD another road 2.5 min later)
- Uploads ask for location, recording date/time (+ optional lat/lon); new Cameras page edits them
- Results show location, real-world date/time, video position, time between cameras and a map
- Re-ID time window now uses real-world time (5 s - 12 h); unknown starts are not time-limited
- Tests, demo evaluation, docs, deck and reports updated

Co-Authored-By: Claude Opus 5.5 <noreply@anthropic.com>
</commit_message>
<xml_diff>
--- a/deliverables/V-Trace_Demo_Guide.docx
+++ b/deliverables/V-Trace_Demo_Guide.docx
@@ -152,13 +152,22 @@
     </w:p>
     <w:p>
       <w:r>
-        <w:t xml:space="preserve">The app has two pages (left sidebar): </w:t>
+        <w:t xml:space="preserve">The app has three pages (left sidebar): </w:t>
       </w:r>
       <w:r>
         <w:rPr>
           <w:b/>
         </w:rPr>
         <w:t>Search</w:t>
+      </w:r>
+      <w:r>
+        <w:t xml:space="preserve">, </w:t>
+      </w:r>
+      <w:r>
+        <w:rPr>
+          <w:b/>
+        </w:rPr>
+        <w:t>Cameras</w:t>
       </w:r>
       <w:r>
         <w:t xml:space="preserve"> and </w:t>
@@ -243,6 +252,44 @@
       </w:r>
       <w:r>
         <w:t xml:space="preserve"> is a different road whose vehicles never appear in A–C.</w:t>
+      </w:r>
+    </w:p>
+    <w:p>
+      <w:r>
+        <w:rPr>
+          <w:b/>
+        </w:rPr>
+        <w:t>Real-world time and location.</w:t>
+      </w:r>
+      <w:r>
+        <w:t xml:space="preserve"> Every camera has a location and a recording start (</w:t>
+      </w:r>
+      <w:r>
+        <w:rPr>
+          <w:b/>
+        </w:rPr>
+        <w:t>Cameras</w:t>
+      </w:r>
+      <w:r>
+        <w:t xml:space="preserve"> page); a sighting's real-world time = recording start + its position in the video. The demo videos carry no such metadata, so their details are curated: camA–camC on Slovenska cesta, Ljubljana, all starting </w:t>
+      </w:r>
+      <w:r>
+        <w:rPr>
+          <w:b/>
+        </w:rPr>
+        <w:t>Wed 28 Oct 2026, 08:15:00</w:t>
+      </w:r>
+      <w:r>
+        <w:t xml:space="preserve"> (same clock), and camD on Celovška cesta, starting </w:t>
+      </w:r>
+      <w:r>
+        <w:rPr>
+          <w:b/>
+        </w:rPr>
+        <w:t>08:17:30</w:t>
+      </w:r>
+      <w:r>
+        <w:t xml:space="preserve"> (2.5 min later).</w:t>
       </w:r>
     </w:p>
     <w:p>
@@ -345,7 +392,7 @@
         <w:rPr>
           <w:b/>
         </w:rPr>
-        <w:t>camB_centre, 00:42.00 – 00:43.56</w:t>
+        <w:t>camB_centre, 08:15:42.0 – 08:15:43.5</w:t>
       </w:r>
       <w:r>
         <w:t xml:space="preserve">. Click </w:t>
@@ -389,10 +436,10 @@
         <w:rPr>
           <w:b/>
         </w:rPr>
-        <w:t>Route: camA_west (00:40.80) → camB_centre (00:42.00) → camC_east (00:43.56)</w:t>
+        <w:t>Route: camA_west 08:15:40.8 → (+1.2 s) camB_centre 08:15:42.0 → (+1.6 s) camC_east 08:15:43.5</w:t>
       </w:r>
       <w:r>
-        <w:t xml:space="preserve">, with one row per camera: the time span, a crop and the full frame with the car boxed. camA scores 0.67 and camC 0.51. </w:t>
+        <w:t xml:space="preserve">, with one row per camera: the location, the real-world date and time span, the time in the video, a crop and the full frame with the car boxed, plus a map of the camera locations. camA scores 0.67 and camC 0.51. </w:t>
       </w:r>
       <w:r>
         <w:rPr>
@@ -410,7 +457,7 @@
         <w:t>Not seen in</w:t>
       </w:r>
       <w:r>
-        <w:t xml:space="preserve"> ("no vehicle in the time window").</w:t>
+        <w:t xml:space="preserve"> ("no vehicle within 10.0 s"): it was recorded minutes later.</w:t>
       </w:r>
     </w:p>
     <w:p>
@@ -433,7 +480,7 @@
         <w:rPr>
           <w:b/>
         </w:rPr>
-        <w:t>camA_west, 00:40.80</w:t>
+        <w:t>camA_west, 08:15:40.8</w:t>
       </w:r>
       <w:r>
         <w:t>).</w:t>
@@ -465,7 +512,7 @@
     </w:p>
     <w:p>
       <w:r>
-        <w:t>true car (00:42.00) is first with 0.67, but another red car (00:39.96) scores 0.62, too close to call, so the ratio test leaves the choice to the user. Good talking point: the system shows evidence, it does not claim an identity. (Searching from the camB sighting, as in Scenario A, gives a clear answer because camB's view of the car is sharper.)</w:t>
+        <w:t>true car (08:15:42.0) is first with 0.67, but another red car (08:15:39.9) scores 0.62, too close to call, so the ratio test leaves the choice to the user. Good talking point: the system shows evidence, it does not claim an identity. (Searching from the camB sighting, as in Scenario A, gives a clear answer because camB's view of the car is sharper.)</w:t>
       </w:r>
     </w:p>
     <w:p>
@@ -473,7 +520,89 @@
         <w:rPr>
           <w:b/>
         </w:rPr>
-        <w:t>Scenario C – upload videos</w:t>
+        <w:t>Scenario C – real-world time decides (cameras a minute apart)</w:t>
+      </w:r>
+    </w:p>
+    <w:p>
+      <w:pPr>
+        <w:pStyle w:val="ListBullet"/>
+        <w:spacing w:after="60"/>
+      </w:pPr>
+      <w:r>
+        <w:rPr>
+          <w:b/>
+        </w:rPr>
+        <w:t>Cameras</w:t>
+      </w:r>
+      <w:r>
+        <w:t xml:space="preserve"> page: change camC_east's recording start to </w:t>
+      </w:r>
+      <w:r>
+        <w:rPr>
+          <w:b/>
+        </w:rPr>
+        <w:t>08:14:00</w:t>
+      </w:r>
+      <w:r>
+        <w:t xml:space="preserve"> (1 min earlier) and click </w:t>
+      </w:r>
+      <w:r>
+        <w:rPr>
+          <w:b/>
+        </w:rPr>
+        <w:t>Save camera details</w:t>
+      </w:r>
+      <w:r>
+        <w:t>.</w:t>
+      </w:r>
+    </w:p>
+    <w:p>
+      <w:pPr>
+        <w:pStyle w:val="ListBullet"/>
+        <w:spacing w:after="60"/>
+      </w:pPr>
+      <w:r>
+        <w:t>Repeat Scenario A: camC's sighting is now at 08:14:43.5, about a minute before the others, so with the 10 s limit it</w:t>
+      </w:r>
+    </w:p>
+    <w:p>
+      <w:r>
+        <w:t xml:space="preserve">is </w:t>
+      </w:r>
+      <w:r>
+        <w:rPr>
+          <w:i/>
+        </w:rPr>
+        <w:t>Not seen</w:t>
+      </w:r>
+      <w:r>
+        <w:t xml:space="preserve">. Sidebar → Settings → </w:t>
+      </w:r>
+      <w:r>
+        <w:rPr>
+          <w:i/>
+        </w:rPr>
+        <w:t>Max time between cameras</w:t>
+      </w:r>
+      <w:r>
+        <w:t xml:space="preserve"> </w:t>
+      </w:r>
+      <w:r>
+        <w:rPr>
+          <w:b/>
+        </w:rPr>
+        <w:t>1 min 00 s</w:t>
+      </w:r>
+      <w:r>
+        <w:t>: it is matched again and the route is re-ordered in real-world time (camC → camA → camB). camD (recorded from 08:17:30) stays out. Set camC back to 08:15:00 afterwards.</w:t>
+      </w:r>
+    </w:p>
+    <w:p>
+      <w:r>
+        <w:rPr>
+          <w:b/>
+        </w:rPr>
+        <w:t>Scenario D – upload videos</w:t>
       </w:r>
     </w:p>
     <w:p>
@@ -491,7 +620,36 @@
         <w:t>Upload new videos</w:t>
       </w:r>
       <w:r>
-        <w:t xml:space="preserve">, add two or three short clips (10–30 s), keep </w:t>
+        <w:t xml:space="preserve">, add two or three short clips (10–30 s). For each clip enter its </w:t>
+      </w:r>
+      <w:r>
+        <w:rPr>
+          <w:b/>
+        </w:rPr>
+        <w:t>location</w:t>
+      </w:r>
+      <w:r>
+        <w:t>,</w:t>
+      </w:r>
+    </w:p>
+    <w:p>
+      <w:r>
+        <w:rPr>
+          <w:b/>
+        </w:rPr>
+        <w:t>recording date</w:t>
+      </w:r>
+      <w:r>
+        <w:t xml:space="preserve"> and </w:t>
+      </w:r>
+      <w:r>
+        <w:rPr>
+          <w:b/>
+        </w:rPr>
+        <w:t>start time</w:t>
+      </w:r>
+      <w:r>
+        <w:t xml:space="preserve"> (latitude/longitude optional), keep </w:t>
       </w:r>
       <w:r>
         <w:rPr>
@@ -500,10 +658,8 @@
         <w:t>Fast processing</w:t>
       </w:r>
       <w:r>
-        <w:t xml:space="preserve"> on, click</w:t>
+        <w:t xml:space="preserve"> on, click </w:t>
       </w:r>
-    </w:p>
-    <w:p>
       <w:r>
         <w:rPr>
           <w:b/>
@@ -511,7 +667,16 @@
         <w:t>Process videos</w:t>
       </w:r>
       <w:r>
-        <w:t>. Each clip becomes one camera; describe and select a vehicle as above. Uploaded videos are assumed to be recorded at different times, so the time window is off (Settings).</w:t>
+        <w:t xml:space="preserve">. Each clip becomes one camera; describe and select a vehicle as above. For uploads the real-world time limit is off until you turn it on (Settings), in case the clocks are not set; details can be edited later on the </w:t>
+      </w:r>
+      <w:r>
+        <w:rPr>
+          <w:b/>
+        </w:rPr>
+        <w:t>Cameras</w:t>
+      </w:r>
+      <w:r>
+        <w:t xml:space="preserve"> page.</w:t>
       </w:r>
     </w:p>
     <w:p>
@@ -542,7 +707,12 @@
         <w:spacing w:after="60"/>
       </w:pPr>
       <w:r>
-        <w:t>A sighting = all frames in which one vehicle is seen continuously in one camera.</w:t>
+        <w:t>A sighting = all frames in which one vehicle is seen continuously in one camera; its real-world time = camera</w:t>
+      </w:r>
+    </w:p>
+    <w:p>
+      <w:r>
+        <w:t>recording start + its position in the video, so cameras can be seconds, minutes or hours apart.</w:t>
       </w:r>
     </w:p>
     <w:p>
@@ -560,12 +730,12 @@
         <w:spacing w:after="60"/>
       </w:pPr>
       <w:r>
-        <w:t>A camera counts as "seen" only when its best sighting is similar enough (≥ 0.40) and clearly better than the</w:t>
+        <w:t>A camera counts as "seen" only when its best sighting is similar enough (≥ 0.40), clearly better than the next one</w:t>
       </w:r>
     </w:p>
     <w:p>
       <w:r>
-        <w:t>next one; for demo videos it must also be within 10 s.</w:t>
+        <w:t>and, with the time limit on, close enough in real-world time (default 10 s).</w:t>
       </w:r>
     </w:p>
     <w:p>
@@ -889,14 +1059,27 @@
               <w:rPr>
                 <w:sz w:val="19"/>
               </w:rPr>
-              <w:t xml:space="preserve">Change the threshold or turn off </w:t>
+              <w:t xml:space="preserve">Change the threshold, the </w:t>
             </w:r>
             <w:r>
               <w:rPr>
                 <w:i/>
                 <w:sz w:val="19"/>
               </w:rPr>
-              <w:t>Videos were recorded at the same time</w:t>
+              <w:t>Max time between cameras</w:t>
+            </w:r>
+            <w:r>
+              <w:rPr>
+                <w:sz w:val="19"/>
+              </w:rPr>
+              <w:t xml:space="preserve"> or turn off </w:t>
+            </w:r>
+            <w:r>
+              <w:rPr>
+                <w:i/>
+                <w:sz w:val="19"/>
+              </w:rPr>
+              <w:t>Limit by real-world time</w:t>
             </w:r>
           </w:p>
         </w:tc>
@@ -928,7 +1111,7 @@
               <w:rPr>
                 <w:sz w:val="19"/>
               </w:rPr>
-              <w:t>stricter / looser matching; the time window</w:t>
+              <w:t>stricter / looser matching; the real-world time window</w:t>
             </w:r>
           </w:p>
         </w:tc>
@@ -938,6 +1121,58 @@
           <w:tcPr>
             <w:tcW w:type="dxa" w:w="3137"/>
             <w:shd w:val="clear" w:color="auto" w:fill="EAF7F6"/>
+          </w:tcPr>
+          <w:p>
+            <w:pPr>
+              <w:spacing w:after="0"/>
+            </w:pPr>
+            <w:r>
+              <w:rPr>
+                <w:sz w:val="19"/>
+              </w:rPr>
+              <w:t>Edit a camera's location or recording start</w:t>
+            </w:r>
+          </w:p>
+        </w:tc>
+        <w:tc>
+          <w:tcPr>
+            <w:tcW w:type="dxa" w:w="3137"/>
+            <w:shd w:val="clear" w:color="auto" w:fill="EAF7F6"/>
+          </w:tcPr>
+          <w:p>
+            <w:pPr>
+              <w:spacing w:after="0"/>
+            </w:pPr>
+            <w:r>
+              <w:rPr>
+                <w:sz w:val="19"/>
+              </w:rPr>
+              <w:t>Cameras page</w:t>
+            </w:r>
+          </w:p>
+        </w:tc>
+        <w:tc>
+          <w:tcPr>
+            <w:tcW w:type="dxa" w:w="3137"/>
+            <w:shd w:val="clear" w:color="auto" w:fill="EAF7F6"/>
+          </w:tcPr>
+          <w:p>
+            <w:pPr>
+              <w:spacing w:after="0"/>
+            </w:pPr>
+            <w:r>
+              <w:rPr>
+                <w:sz w:val="19"/>
+              </w:rPr>
+              <w:t>real-world times and the route update</w:t>
+            </w:r>
+          </w:p>
+        </w:tc>
+      </w:tr>
+      <w:tr>
+        <w:tc>
+          <w:tcPr>
+            <w:tcW w:type="dxa" w:w="3137"/>
           </w:tcPr>
           <w:p>
             <w:pPr>
@@ -955,7 +1190,6 @@
         <w:tc>
           <w:tcPr>
             <w:tcW w:type="dxa" w:w="3137"/>
-            <w:shd w:val="clear" w:color="auto" w:fill="EAF7F6"/>
           </w:tcPr>
           <w:p>
             <w:pPr>
@@ -972,7 +1206,6 @@
         <w:tc>
           <w:tcPr>
             <w:tcW w:type="dxa" w:w="3137"/>
-            <w:shd w:val="clear" w:color="auto" w:fill="EAF7F6"/>
           </w:tcPr>
           <w:p>
             <w:pPr>

</xml_diff>

<commit_message>
Singapore camera locations, upload test pack, simpler sidebar, IRS-format reports
- Curated demo/test camera locations moved to Singapore (Orchard Road / Bukit Timah Road)
- test_videos/: 7 upload-ready clips with built-in camera details and verified expected results
  (scripts/make_test_videos.py); details fill in automatically on upload
- Sidebar trimmed to video source, camera count, Settings and Sign out; upload form asks location + start time
- Demo evaluation adds a decision-rule ablation (threshold only / + ratio test / + real-time window)
- Final report restructured to the IRS report format; individual report in the PRS template (make_individual.py)
- Deck, demo guide, README and docs updated

Co-Authored-By: Claude Opus 5.5 <noreply@anthropic.com>
</commit_message>
<xml_diff>
--- a/deliverables/V-Trace_Demo_Guide.docx
+++ b/deliverables/V-Trace_Demo_Guide.docx
@@ -271,7 +271,7 @@
         <w:t>Cameras</w:t>
       </w:r>
       <w:r>
-        <w:t xml:space="preserve"> page); a sighting's real-world time = recording start + its position in the video. The demo videos carry no such metadata, so their details are curated: camA–camC on Slovenska cesta, Ljubljana, all starting </w:t>
+        <w:t xml:space="preserve"> page); a sighting's real-world time = recording start + its position in the video. The demo videos carry no such metadata, so their details are curated and placed in Singapore: camA–camC on Orchard Road around the Scotts Road junction, all starting </w:t>
       </w:r>
       <w:r>
         <w:rPr>
@@ -280,7 +280,7 @@
         <w:t>Wed 28 Oct 2026, 08:15:00</w:t>
       </w:r>
       <w:r>
-        <w:t xml:space="preserve"> (same clock), and camD on Celovška cesta, starting </w:t>
+        <w:t xml:space="preserve"> (same clock), and camD on Bukit Timah Road near Newton Circus, starting </w:t>
       </w:r>
       <w:r>
         <w:rPr>
@@ -602,7 +602,7 @@
         <w:rPr>
           <w:b/>
         </w:rPr>
-        <w:t>Scenario D – upload videos</w:t>
+        <w:t>Scenario D – upload videos (test pack)</w:t>
       </w:r>
     </w:p>
     <w:p>
@@ -620,45 +620,42 @@
         <w:t>Upload new videos</w:t>
       </w:r>
       <w:r>
-        <w:t xml:space="preserve">, add two or three short clips (10–30 s). For each clip enter its </w:t>
+        <w:t xml:space="preserve">, add the three </w:t>
       </w:r>
       <w:r>
         <w:rPr>
-          <w:b/>
+          <w:rFonts w:ascii="Consolas" w:hAnsi="Consolas"/>
+          <w:color w:val="0E8782"/>
+          <w:sz w:val="20"/>
         </w:rPr>
-        <w:t>location</w:t>
+        <w:t>set1_orchard_*.mp4</w:t>
       </w:r>
       <w:r>
-        <w:t>,</w:t>
+        <w:t xml:space="preserve"> files from </w:t>
+      </w:r>
+      <w:r>
+        <w:rPr>
+          <w:rFonts w:ascii="Consolas" w:hAnsi="Consolas"/>
+          <w:color w:val="0E8782"/>
+          <w:sz w:val="20"/>
+        </w:rPr>
+        <w:t>test_videos/</w:t>
+      </w:r>
+      <w:r>
+        <w:t xml:space="preserve"> (optionally also</w:t>
       </w:r>
     </w:p>
     <w:p>
       <w:r>
         <w:rPr>
-          <w:b/>
+          <w:rFonts w:ascii="Consolas" w:hAnsi="Consolas"/>
+          <w:color w:val="0E8782"/>
+          <w:sz w:val="20"/>
         </w:rPr>
-        <w:t>recording date</w:t>
+        <w:t>set3_bukit_timah.mp4</w:t>
       </w:r>
       <w:r>
-        <w:t xml:space="preserve"> and </w:t>
-      </w:r>
-      <w:r>
-        <w:rPr>
-          <w:b/>
-        </w:rPr>
-        <w:t>start time</w:t>
-      </w:r>
-      <w:r>
-        <w:t xml:space="preserve"> (latitude/longitude optional), keep </w:t>
-      </w:r>
-      <w:r>
-        <w:rPr>
-          <w:b/>
-        </w:rPr>
-        <w:t>Fast processing</w:t>
-      </w:r>
-      <w:r>
-        <w:t xml:space="preserve"> on, click </w:t>
+        <w:t xml:space="preserve">) and click </w:t>
       </w:r>
       <w:r>
         <w:rPr>
@@ -667,7 +664,82 @@
         <w:t>Process videos</w:t>
       </w:r>
       <w:r>
-        <w:t xml:space="preserve">. Each clip becomes one camera; describe and select a vehicle as above. For uploads the real-world time limit is off until you turn it on (Settings), in case the clocks are not set; details can be edited later on the </w:t>
+        <w:t xml:space="preserve"> (about 20–25 s per clip on a laptop). The location and start time fill in automatically for these files, and the real-world time limit is switched on.</w:t>
+      </w:r>
+    </w:p>
+    <w:p>
+      <w:pPr>
+        <w:pStyle w:val="ListBullet"/>
+        <w:spacing w:after="60"/>
+      </w:pPr>
+      <w:r>
+        <w:t xml:space="preserve">Describe Colour </w:t>
+      </w:r>
+      <w:r>
+        <w:rPr>
+          <w:b/>
+        </w:rPr>
+        <w:t>gray</w:t>
+      </w:r>
+      <w:r>
+        <w:t xml:space="preserve">, Type </w:t>
+      </w:r>
+      <w:r>
+        <w:rPr>
+          <w:b/>
+        </w:rPr>
+        <w:t>suv</w:t>
+      </w:r>
+      <w:r>
+        <w:t xml:space="preserve">, select </w:t>
+      </w:r>
+      <w:r>
+        <w:rPr>
+          <w:b/>
+        </w:rPr>
+        <w:t>#1</w:t>
+      </w:r>
+      <w:r>
+        <w:t xml:space="preserve"> (west camera, 17:45:04.0): the route shows the Scotts Road</w:t>
+      </w:r>
+    </w:p>
+    <w:p>
+      <w:r>
+        <w:t xml:space="preserve">junction 3.2 s later. More scenarios with expected results are in </w:t>
+      </w:r>
+      <w:r>
+        <w:rPr>
+          <w:rFonts w:ascii="Consolas" w:hAnsi="Consolas"/>
+          <w:color w:val="0E8782"/>
+          <w:sz w:val="20"/>
+        </w:rPr>
+        <w:t>test_videos/README.md</w:t>
+      </w:r>
+      <w:r>
+        <w:t>.</w:t>
+      </w:r>
+    </w:p>
+    <w:p>
+      <w:pPr>
+        <w:pStyle w:val="ListBullet"/>
+        <w:spacing w:after="60"/>
+      </w:pPr>
+      <w:r>
+        <w:t xml:space="preserve">For your own clips, open each file's </w:t>
+      </w:r>
+      <w:r>
+        <w:rPr>
+          <w:i/>
+        </w:rPr>
+        <w:t>location &amp; start time</w:t>
+      </w:r>
+      <w:r>
+        <w:t xml:space="preserve"> box and enter them before processing; for uploads with</w:t>
+      </w:r>
+    </w:p>
+    <w:p>
+      <w:r>
+        <w:t xml:space="preserve">unknown clocks the real-world time limit stays off (Settings). Details can be edited later on the </w:t>
       </w:r>
       <w:r>
         <w:rPr>
@@ -1185,6 +1257,26 @@
               </w:rPr>
               <w:t>Upload new videos</w:t>
             </w:r>
+            <w:r>
+              <w:rPr>
+                <w:sz w:val="19"/>
+              </w:rPr>
+              <w:t xml:space="preserve"> with a set from </w:t>
+            </w:r>
+            <w:r>
+              <w:rPr>
+                <w:rFonts w:ascii="Consolas" w:hAnsi="Consolas"/>
+                <w:color w:val="0E8782"/>
+                <w:sz w:val="17"/>
+              </w:rPr>
+              <w:t>test_videos/</w:t>
+            </w:r>
+            <w:r>
+              <w:rPr>
+                <w:sz w:val="19"/>
+              </w:rPr>
+              <w:t xml:space="preserve"> (see its README)</w:t>
+            </w:r>
           </w:p>
         </w:tc>
         <w:tc>
@@ -1215,7 +1307,7 @@
               <w:rPr>
                 <w:sz w:val="19"/>
               </w:rPr>
-              <w:t>the full pipeline on new footage</w:t>
+              <w:t>the full pipeline on new footage, with expected results</w:t>
             </w:r>
           </w:p>
         </w:tc>

</xml_diff>

<commit_message>
Demo guide: verified search combinations for the demo cameras and the test sets
Co-Authored-By: Claude Opus 5.5 <noreply@anthropic.com>
</commit_message>
<xml_diff>
--- a/deliverables/V-Trace_Demo_Guide.docx
+++ b/deliverables/V-Trace_Demo_Guide.docx
@@ -830,7 +830,1627 @@
         <w:pStyle w:val="Heading2"/>
       </w:pPr>
       <w:r>
-        <w:t>3. Things to try (assessors)</w:t>
+        <w:t>3. Search combinations that work</w:t>
+      </w:r>
+    </w:p>
+    <w:p>
+      <w:r>
+        <w:t xml:space="preserve">Every combination below was checked against the reference identities (the full-frame tracking used in </w:t>
+      </w:r>
+      <w:r>
+        <w:rPr>
+          <w:rFonts w:ascii="Consolas" w:hAnsi="Consolas"/>
+          <w:color w:val="0E8782"/>
+          <w:sz w:val="20"/>
+        </w:rPr>
+        <w:t>scripts/demo_eval.py</w:t>
+      </w:r>
+      <w:r>
+        <w:t xml:space="preserve">). Leave all other fields empty, click </w:t>
+      </w:r>
+      <w:r>
+        <w:rPr>
+          <w:b/>
+        </w:rPr>
+        <w:t>Search</w:t>
+      </w:r>
+      <w:r>
+        <w:t xml:space="preserve">, then </w:t>
+      </w:r>
+      <w:r>
+        <w:rPr>
+          <w:b/>
+        </w:rPr>
+        <w:t>Select</w:t>
+      </w:r>
+      <w:r>
+        <w:t xml:space="preserve"> the listed result. Settings at their defaults (threshold 0.40, real-world time limit on, 10 s).</w:t>
+      </w:r>
+    </w:p>
+    <w:p>
+      <w:r>
+        <w:rPr>
+          <w:b/>
+        </w:rPr>
+        <w:t>Built-in demo cameras</w:t>
+      </w:r>
+      <w:r>
+        <w:t xml:space="preserve"> (sidebar → </w:t>
+      </w:r>
+      <w:r>
+        <w:rPr>
+          <w:i/>
+        </w:rPr>
+        <w:t>Demo videos</w:t>
+      </w:r>
+      <w:r>
+        <w:t>)</w:t>
+      </w:r>
+    </w:p>
+    <w:tbl>
+      <w:tblPr>
+        <w:tblStyle w:val="TableGrid"/>
+        <w:tblW w:type="auto" w:w="0"/>
+        <w:jc w:val="center"/>
+        <w:tblLook w:firstColumn="1" w:firstRow="1" w:lastColumn="0" w:lastRow="0" w:noHBand="0" w:noVBand="1" w:val="04A0"/>
+      </w:tblPr>
+      <w:tblGrid>
+        <w:gridCol w:w="3137"/>
+        <w:gridCol w:w="3137"/>
+        <w:gridCol w:w="3137"/>
+      </w:tblGrid>
+      <w:tr>
+        <w:tc>
+          <w:tcPr>
+            <w:tcW w:type="dxa" w:w="3137"/>
+            <w:shd w:val="clear" w:color="auto" w:fill="34454D"/>
+          </w:tcPr>
+          <w:p>
+            <w:pPr>
+              <w:spacing w:after="0"/>
+            </w:pPr>
+            <w:r>
+              <w:rPr>
+                <w:b/>
+                <w:color w:val="FFFFFF"/>
+                <w:sz w:val="19"/>
+              </w:rPr>
+              <w:t>Describe</w:t>
+            </w:r>
+          </w:p>
+        </w:tc>
+        <w:tc>
+          <w:tcPr>
+            <w:tcW w:type="dxa" w:w="3137"/>
+            <w:shd w:val="clear" w:color="auto" w:fill="34454D"/>
+          </w:tcPr>
+          <w:p>
+            <w:pPr>
+              <w:spacing w:after="0"/>
+            </w:pPr>
+            <w:r>
+              <w:rPr>
+                <w:b/>
+                <w:color w:val="FFFFFF"/>
+                <w:sz w:val="19"/>
+              </w:rPr>
+              <w:t>Select</w:t>
+            </w:r>
+          </w:p>
+        </w:tc>
+        <w:tc>
+          <w:tcPr>
+            <w:tcW w:type="dxa" w:w="3137"/>
+            <w:shd w:val="clear" w:color="auto" w:fill="34454D"/>
+          </w:tcPr>
+          <w:p>
+            <w:pPr>
+              <w:spacing w:after="0"/>
+            </w:pPr>
+            <w:r>
+              <w:rPr>
+                <w:b/>
+                <w:color w:val="FFFFFF"/>
+                <w:sz w:val="19"/>
+              </w:rPr>
+              <w:t>Where this vehicle was seen</w:t>
+            </w:r>
+          </w:p>
+        </w:tc>
+      </w:tr>
+      <w:tr>
+        <w:tc>
+          <w:tcPr>
+            <w:tcW w:type="dxa" w:w="3137"/>
+          </w:tcPr>
+          <w:p>
+            <w:pPr>
+              <w:spacing w:after="0"/>
+            </w:pPr>
+            <w:r>
+              <w:rPr>
+                <w:sz w:val="19"/>
+              </w:rPr>
+              <w:t xml:space="preserve">Colour </w:t>
+            </w:r>
+            <w:r>
+              <w:rPr>
+                <w:b/>
+                <w:sz w:val="19"/>
+              </w:rPr>
+              <w:t>red</w:t>
+            </w:r>
+            <w:r>
+              <w:rPr>
+                <w:sz w:val="19"/>
+              </w:rPr>
+              <w:t xml:space="preserve">, Type </w:t>
+            </w:r>
+            <w:r>
+              <w:rPr>
+                <w:b/>
+                <w:sz w:val="19"/>
+              </w:rPr>
+              <w:t>suv</w:t>
+            </w:r>
+          </w:p>
+        </w:tc>
+        <w:tc>
+          <w:tcPr>
+            <w:tcW w:type="dxa" w:w="3137"/>
+          </w:tcPr>
+          <w:p>
+            <w:pPr>
+              <w:spacing w:after="0"/>
+            </w:pPr>
+            <w:r>
+              <w:rPr>
+                <w:sz w:val="19"/>
+              </w:rPr>
+              <w:t>#3 · camB_centre · 08:15:42.0</w:t>
+            </w:r>
+          </w:p>
+        </w:tc>
+        <w:tc>
+          <w:tcPr>
+            <w:tcW w:type="dxa" w:w="3137"/>
+          </w:tcPr>
+          <w:p>
+            <w:pPr>
+              <w:spacing w:after="0"/>
+            </w:pPr>
+            <w:r>
+              <w:rPr>
+                <w:sz w:val="19"/>
+              </w:rPr>
+              <w:t>camA 08:15:40.8 → camB 08:15:42.0 → camC 08:15:43.5 (all three cameras)</w:t>
+            </w:r>
+          </w:p>
+        </w:tc>
+      </w:tr>
+      <w:tr>
+        <w:tc>
+          <w:tcPr>
+            <w:tcW w:type="dxa" w:w="3137"/>
+            <w:shd w:val="clear" w:color="auto" w:fill="EAF7F6"/>
+          </w:tcPr>
+          <w:p>
+            <w:pPr>
+              <w:spacing w:after="0"/>
+            </w:pPr>
+            <w:r>
+              <w:rPr>
+                <w:sz w:val="19"/>
+              </w:rPr>
+              <w:t xml:space="preserve">Colour </w:t>
+            </w:r>
+            <w:r>
+              <w:rPr>
+                <w:b/>
+                <w:sz w:val="19"/>
+              </w:rPr>
+              <w:t>green</w:t>
+            </w:r>
+            <w:r>
+              <w:rPr>
+                <w:sz w:val="19"/>
+              </w:rPr>
+              <w:t xml:space="preserve"> (Type any)</w:t>
+            </w:r>
+          </w:p>
+        </w:tc>
+        <w:tc>
+          <w:tcPr>
+            <w:tcW w:type="dxa" w:w="3137"/>
+            <w:shd w:val="clear" w:color="auto" w:fill="EAF7F6"/>
+          </w:tcPr>
+          <w:p>
+            <w:pPr>
+              <w:spacing w:after="0"/>
+            </w:pPr>
+            <w:r>
+              <w:rPr>
+                <w:sz w:val="19"/>
+              </w:rPr>
+              <w:t>#2 · camA_west · 08:15:00.9</w:t>
+            </w:r>
+          </w:p>
+        </w:tc>
+        <w:tc>
+          <w:tcPr>
+            <w:tcW w:type="dxa" w:w="3137"/>
+            <w:shd w:val="clear" w:color="auto" w:fill="EAF7F6"/>
+          </w:tcPr>
+          <w:p>
+            <w:pPr>
+              <w:spacing w:after="0"/>
+            </w:pPr>
+            <w:r>
+              <w:rPr>
+                <w:sz w:val="19"/>
+              </w:rPr>
+              <w:t>camA 08:15:00.9 → camB 08:15:06.6 → camC 08:15:07.9 (all three cameras)</w:t>
+            </w:r>
+          </w:p>
+        </w:tc>
+      </w:tr>
+      <w:tr>
+        <w:tc>
+          <w:tcPr>
+            <w:tcW w:type="dxa" w:w="3137"/>
+          </w:tcPr>
+          <w:p>
+            <w:pPr>
+              <w:spacing w:after="0"/>
+            </w:pPr>
+            <w:r>
+              <w:rPr>
+                <w:sz w:val="19"/>
+              </w:rPr>
+              <w:t xml:space="preserve">Colour </w:t>
+            </w:r>
+            <w:r>
+              <w:rPr>
+                <w:b/>
+                <w:sz w:val="19"/>
+              </w:rPr>
+              <w:t>black</w:t>
+            </w:r>
+            <w:r>
+              <w:rPr>
+                <w:sz w:val="19"/>
+              </w:rPr>
+              <w:t xml:space="preserve">, Type </w:t>
+            </w:r>
+            <w:r>
+              <w:rPr>
+                <w:b/>
+                <w:sz w:val="19"/>
+              </w:rPr>
+              <w:t>suv</w:t>
+            </w:r>
+          </w:p>
+        </w:tc>
+        <w:tc>
+          <w:tcPr>
+            <w:tcW w:type="dxa" w:w="3137"/>
+          </w:tcPr>
+          <w:p>
+            <w:pPr>
+              <w:spacing w:after="0"/>
+            </w:pPr>
+            <w:r>
+              <w:rPr>
+                <w:sz w:val="19"/>
+              </w:rPr>
+              <w:t>#1 · camA_west · 08:15:02.8</w:t>
+            </w:r>
+          </w:p>
+        </w:tc>
+        <w:tc>
+          <w:tcPr>
+            <w:tcW w:type="dxa" w:w="3137"/>
+          </w:tcPr>
+          <w:p>
+            <w:pPr>
+              <w:spacing w:after="0"/>
+            </w:pPr>
+            <w:r>
+              <w:rPr>
+                <w:sz w:val="19"/>
+              </w:rPr>
+              <w:t>camA 08:15:02.8 → camB 08:15:05.7</w:t>
+            </w:r>
+          </w:p>
+        </w:tc>
+      </w:tr>
+      <w:tr>
+        <w:tc>
+          <w:tcPr>
+            <w:tcW w:type="dxa" w:w="3137"/>
+            <w:shd w:val="clear" w:color="auto" w:fill="EAF7F6"/>
+          </w:tcPr>
+          <w:p>
+            <w:pPr>
+              <w:spacing w:after="0"/>
+            </w:pPr>
+            <w:r>
+              <w:rPr>
+                <w:sz w:val="19"/>
+              </w:rPr>
+              <w:t xml:space="preserve">Colour </w:t>
+            </w:r>
+            <w:r>
+              <w:rPr>
+                <w:b/>
+                <w:sz w:val="19"/>
+              </w:rPr>
+              <w:t>black</w:t>
+            </w:r>
+            <w:r>
+              <w:rPr>
+                <w:sz w:val="19"/>
+              </w:rPr>
+              <w:t xml:space="preserve">, Type </w:t>
+            </w:r>
+            <w:r>
+              <w:rPr>
+                <w:b/>
+                <w:sz w:val="19"/>
+              </w:rPr>
+              <w:t>suv</w:t>
+            </w:r>
+          </w:p>
+        </w:tc>
+        <w:tc>
+          <w:tcPr>
+            <w:tcW w:type="dxa" w:w="3137"/>
+            <w:shd w:val="clear" w:color="auto" w:fill="EAF7F6"/>
+          </w:tcPr>
+          <w:p>
+            <w:pPr>
+              <w:spacing w:after="0"/>
+            </w:pPr>
+            <w:r>
+              <w:rPr>
+                <w:sz w:val="19"/>
+              </w:rPr>
+              <w:t>#3 · camA_west · 08:15:20.0</w:t>
+            </w:r>
+          </w:p>
+        </w:tc>
+        <w:tc>
+          <w:tcPr>
+            <w:tcW w:type="dxa" w:w="3137"/>
+            <w:shd w:val="clear" w:color="auto" w:fill="EAF7F6"/>
+          </w:tcPr>
+          <w:p>
+            <w:pPr>
+              <w:spacing w:after="0"/>
+            </w:pPr>
+            <w:r>
+              <w:rPr>
+                <w:sz w:val="19"/>
+              </w:rPr>
+              <w:t>camB 08:15:18.2 → camA 08:15:20.0 (far lane, B before A)</w:t>
+            </w:r>
+          </w:p>
+        </w:tc>
+      </w:tr>
+      <w:tr>
+        <w:tc>
+          <w:tcPr>
+            <w:tcW w:type="dxa" w:w="3137"/>
+          </w:tcPr>
+          <w:p>
+            <w:pPr>
+              <w:spacing w:after="0"/>
+            </w:pPr>
+            <w:r>
+              <w:rPr>
+                <w:sz w:val="19"/>
+              </w:rPr>
+              <w:t xml:space="preserve">Colour </w:t>
+            </w:r>
+            <w:r>
+              <w:rPr>
+                <w:b/>
+                <w:sz w:val="19"/>
+              </w:rPr>
+              <w:t>white</w:t>
+            </w:r>
+            <w:r>
+              <w:rPr>
+                <w:sz w:val="19"/>
+              </w:rPr>
+              <w:t xml:space="preserve">, Type </w:t>
+            </w:r>
+            <w:r>
+              <w:rPr>
+                <w:b/>
+                <w:sz w:val="19"/>
+              </w:rPr>
+              <w:t>sedan</w:t>
+            </w:r>
+          </w:p>
+        </w:tc>
+        <w:tc>
+          <w:tcPr>
+            <w:tcW w:type="dxa" w:w="3137"/>
+          </w:tcPr>
+          <w:p>
+            <w:pPr>
+              <w:spacing w:after="0"/>
+            </w:pPr>
+            <w:r>
+              <w:rPr>
+                <w:sz w:val="19"/>
+              </w:rPr>
+              <w:t>#3 · camA_west · 08:15:22.4</w:t>
+            </w:r>
+          </w:p>
+        </w:tc>
+        <w:tc>
+          <w:tcPr>
+            <w:tcW w:type="dxa" w:w="3137"/>
+          </w:tcPr>
+          <w:p>
+            <w:pPr>
+              <w:spacing w:after="0"/>
+            </w:pPr>
+            <w:r>
+              <w:rPr>
+                <w:sz w:val="19"/>
+              </w:rPr>
+              <w:t>camB 08:15:20.5 → camA 08:15:22.4 (far lane)</w:t>
+            </w:r>
+          </w:p>
+        </w:tc>
+      </w:tr>
+    </w:tbl>
+    <w:p>
+      <w:pPr>
+        <w:spacing w:after="40"/>
+      </w:pPr>
+    </w:p>
+    <w:p>
+      <w:r>
+        <w:t>The green car's camA track briefly switches to another car (one crop shows it): a good talking point for why the crops are shown.</w:t>
+      </w:r>
+    </w:p>
+    <w:p>
+      <w:r>
+        <w:rPr>
+          <w:b/>
+        </w:rPr>
+        <w:t>Test pack, set 1</w:t>
+      </w:r>
+      <w:r>
+        <w:t xml:space="preserve"> (upload the three </w:t>
+      </w:r>
+      <w:r>
+        <w:rPr>
+          <w:rFonts w:ascii="Consolas" w:hAnsi="Consolas"/>
+          <w:color w:val="0E8782"/>
+          <w:sz w:val="20"/>
+        </w:rPr>
+        <w:t>set1_orchard_*.mp4</w:t>
+      </w:r>
+      <w:r>
+        <w:t xml:space="preserve">, optionally with </w:t>
+      </w:r>
+      <w:r>
+        <w:rPr>
+          <w:rFonts w:ascii="Consolas" w:hAnsi="Consolas"/>
+          <w:color w:val="0E8782"/>
+          <w:sz w:val="20"/>
+        </w:rPr>
+        <w:t>set3_bukit_timah.mp4</w:t>
+      </w:r>
+      <w:r>
+        <w:t>)</w:t>
+      </w:r>
+    </w:p>
+    <w:tbl>
+      <w:tblPr>
+        <w:tblStyle w:val="TableGrid"/>
+        <w:tblW w:type="auto" w:w="0"/>
+        <w:jc w:val="center"/>
+        <w:tblLook w:firstColumn="1" w:firstRow="1" w:lastColumn="0" w:lastRow="0" w:noHBand="0" w:noVBand="1" w:val="04A0"/>
+      </w:tblPr>
+      <w:tblGrid>
+        <w:gridCol w:w="3137"/>
+        <w:gridCol w:w="3137"/>
+        <w:gridCol w:w="3137"/>
+      </w:tblGrid>
+      <w:tr>
+        <w:tc>
+          <w:tcPr>
+            <w:tcW w:type="dxa" w:w="3137"/>
+            <w:shd w:val="clear" w:color="auto" w:fill="34454D"/>
+          </w:tcPr>
+          <w:p>
+            <w:pPr>
+              <w:spacing w:after="0"/>
+            </w:pPr>
+            <w:r>
+              <w:rPr>
+                <w:b/>
+                <w:color w:val="FFFFFF"/>
+                <w:sz w:val="19"/>
+              </w:rPr>
+              <w:t>Describe</w:t>
+            </w:r>
+          </w:p>
+        </w:tc>
+        <w:tc>
+          <w:tcPr>
+            <w:tcW w:type="dxa" w:w="3137"/>
+            <w:shd w:val="clear" w:color="auto" w:fill="34454D"/>
+          </w:tcPr>
+          <w:p>
+            <w:pPr>
+              <w:spacing w:after="0"/>
+            </w:pPr>
+            <w:r>
+              <w:rPr>
+                <w:b/>
+                <w:color w:val="FFFFFF"/>
+                <w:sz w:val="19"/>
+              </w:rPr>
+              <w:t>Select</w:t>
+            </w:r>
+          </w:p>
+        </w:tc>
+        <w:tc>
+          <w:tcPr>
+            <w:tcW w:type="dxa" w:w="3137"/>
+            <w:shd w:val="clear" w:color="auto" w:fill="34454D"/>
+          </w:tcPr>
+          <w:p>
+            <w:pPr>
+              <w:spacing w:after="0"/>
+            </w:pPr>
+            <w:r>
+              <w:rPr>
+                <w:b/>
+                <w:color w:val="FFFFFF"/>
+                <w:sz w:val="19"/>
+              </w:rPr>
+              <w:t>Where this vehicle was seen</w:t>
+            </w:r>
+          </w:p>
+        </w:tc>
+      </w:tr>
+      <w:tr>
+        <w:tc>
+          <w:tcPr>
+            <w:tcW w:type="dxa" w:w="3137"/>
+          </w:tcPr>
+          <w:p>
+            <w:pPr>
+              <w:spacing w:after="0"/>
+            </w:pPr>
+            <w:r>
+              <w:rPr>
+                <w:sz w:val="19"/>
+              </w:rPr>
+              <w:t xml:space="preserve">Colour </w:t>
+            </w:r>
+            <w:r>
+              <w:rPr>
+                <w:b/>
+                <w:sz w:val="19"/>
+              </w:rPr>
+              <w:t>gray</w:t>
+            </w:r>
+            <w:r>
+              <w:rPr>
+                <w:sz w:val="19"/>
+              </w:rPr>
+              <w:t xml:space="preserve">, Type </w:t>
+            </w:r>
+            <w:r>
+              <w:rPr>
+                <w:b/>
+                <w:sz w:val="19"/>
+              </w:rPr>
+              <w:t>suv</w:t>
+            </w:r>
+          </w:p>
+        </w:tc>
+        <w:tc>
+          <w:tcPr>
+            <w:tcW w:type="dxa" w:w="3137"/>
+          </w:tcPr>
+          <w:p>
+            <w:pPr>
+              <w:spacing w:after="0"/>
+            </w:pPr>
+            <w:r>
+              <w:rPr>
+                <w:sz w:val="19"/>
+              </w:rPr>
+              <w:t>#1 · west · 17:45:04.0</w:t>
+            </w:r>
+          </w:p>
+        </w:tc>
+        <w:tc>
+          <w:tcPr>
+            <w:tcW w:type="dxa" w:w="3137"/>
+          </w:tcPr>
+          <w:p>
+            <w:pPr>
+              <w:spacing w:after="0"/>
+            </w:pPr>
+            <w:r>
+              <w:rPr>
+                <w:sz w:val="19"/>
+              </w:rPr>
+              <w:t>west 17:45:04.0 → Scotts junction 17:45:07.2</w:t>
+            </w:r>
+          </w:p>
+        </w:tc>
+      </w:tr>
+      <w:tr>
+        <w:tc>
+          <w:tcPr>
+            <w:tcW w:type="dxa" w:w="3137"/>
+            <w:shd w:val="clear" w:color="auto" w:fill="EAF7F6"/>
+          </w:tcPr>
+          <w:p>
+            <w:pPr>
+              <w:spacing w:after="0"/>
+            </w:pPr>
+            <w:r>
+              <w:rPr>
+                <w:sz w:val="19"/>
+              </w:rPr>
+              <w:t xml:space="preserve">Colour </w:t>
+            </w:r>
+            <w:r>
+              <w:rPr>
+                <w:b/>
+                <w:sz w:val="19"/>
+              </w:rPr>
+              <w:t>green</w:t>
+            </w:r>
+            <w:r>
+              <w:rPr>
+                <w:sz w:val="19"/>
+              </w:rPr>
+              <w:t xml:space="preserve">, Type </w:t>
+            </w:r>
+            <w:r>
+              <w:rPr>
+                <w:b/>
+                <w:sz w:val="19"/>
+              </w:rPr>
+              <w:t>sedan</w:t>
+            </w:r>
+          </w:p>
+        </w:tc>
+        <w:tc>
+          <w:tcPr>
+            <w:tcW w:type="dxa" w:w="3137"/>
+            <w:shd w:val="clear" w:color="auto" w:fill="EAF7F6"/>
+          </w:tcPr>
+          <w:p>
+            <w:pPr>
+              <w:spacing w:after="0"/>
+            </w:pPr>
+            <w:r>
+              <w:rPr>
+                <w:sz w:val="19"/>
+              </w:rPr>
+              <w:t>#1 · west · 17:45:02.2</w:t>
+            </w:r>
+          </w:p>
+        </w:tc>
+        <w:tc>
+          <w:tcPr>
+            <w:tcW w:type="dxa" w:w="3137"/>
+            <w:shd w:val="clear" w:color="auto" w:fill="EAF7F6"/>
+          </w:tcPr>
+          <w:p>
+            <w:pPr>
+              <w:spacing w:after="0"/>
+            </w:pPr>
+            <w:r>
+              <w:rPr>
+                <w:sz w:val="19"/>
+              </w:rPr>
+              <w:t>west 17:45:02.2 → Scotts junction 17:45:08.2</w:t>
+            </w:r>
+          </w:p>
+        </w:tc>
+      </w:tr>
+      <w:tr>
+        <w:tc>
+          <w:tcPr>
+            <w:tcW w:type="dxa" w:w="3137"/>
+          </w:tcPr>
+          <w:p>
+            <w:pPr>
+              <w:spacing w:after="0"/>
+            </w:pPr>
+            <w:r>
+              <w:rPr>
+                <w:sz w:val="19"/>
+              </w:rPr>
+              <w:t xml:space="preserve">Colour </w:t>
+            </w:r>
+            <w:r>
+              <w:rPr>
+                <w:b/>
+                <w:sz w:val="19"/>
+              </w:rPr>
+              <w:t>white</w:t>
+            </w:r>
+            <w:r>
+              <w:rPr>
+                <w:sz w:val="19"/>
+              </w:rPr>
+              <w:t xml:space="preserve">, Type </w:t>
+            </w:r>
+            <w:r>
+              <w:rPr>
+                <w:b/>
+                <w:sz w:val="19"/>
+              </w:rPr>
+              <w:t>suv</w:t>
+            </w:r>
+          </w:p>
+        </w:tc>
+        <w:tc>
+          <w:tcPr>
+            <w:tcW w:type="dxa" w:w="3137"/>
+          </w:tcPr>
+          <w:p>
+            <w:pPr>
+              <w:spacing w:after="0"/>
+            </w:pPr>
+            <w:r>
+              <w:rPr>
+                <w:sz w:val="19"/>
+              </w:rPr>
+              <w:t>#4 (#7 with set 3) · Scotts junction · 17:45:17.8</w:t>
+            </w:r>
+          </w:p>
+        </w:tc>
+        <w:tc>
+          <w:tcPr>
+            <w:tcW w:type="dxa" w:w="3137"/>
+          </w:tcPr>
+          <w:p>
+            <w:pPr>
+              <w:spacing w:after="0"/>
+            </w:pPr>
+            <w:r>
+              <w:rPr>
+                <w:sz w:val="19"/>
+              </w:rPr>
+              <w:t>west 17:45:17.0 → Scotts junction 17:45:17.8</w:t>
+            </w:r>
+          </w:p>
+        </w:tc>
+      </w:tr>
+      <w:tr>
+        <w:tc>
+          <w:tcPr>
+            <w:tcW w:type="dxa" w:w="3137"/>
+            <w:shd w:val="clear" w:color="auto" w:fill="EAF7F6"/>
+          </w:tcPr>
+          <w:p>
+            <w:pPr>
+              <w:spacing w:after="0"/>
+            </w:pPr>
+            <w:r>
+              <w:rPr>
+                <w:sz w:val="19"/>
+              </w:rPr>
+              <w:t xml:space="preserve">Colour </w:t>
+            </w:r>
+            <w:r>
+              <w:rPr>
+                <w:b/>
+                <w:sz w:val="19"/>
+              </w:rPr>
+              <w:t>white</w:t>
+            </w:r>
+            <w:r>
+              <w:rPr>
+                <w:sz w:val="19"/>
+              </w:rPr>
+              <w:t xml:space="preserve">, Type </w:t>
+            </w:r>
+            <w:r>
+              <w:rPr>
+                <w:b/>
+                <w:sz w:val="19"/>
+              </w:rPr>
+              <w:t>suv</w:t>
+            </w:r>
+          </w:p>
+        </w:tc>
+        <w:tc>
+          <w:tcPr>
+            <w:tcW w:type="dxa" w:w="3137"/>
+            <w:shd w:val="clear" w:color="auto" w:fill="EAF7F6"/>
+          </w:tcPr>
+          <w:p>
+            <w:pPr>
+              <w:spacing w:after="0"/>
+            </w:pPr>
+            <w:r>
+              <w:rPr>
+                <w:sz w:val="19"/>
+              </w:rPr>
+              <w:t>#6 (#9 with set 3) · west · 17:45:01.0</w:t>
+            </w:r>
+          </w:p>
+        </w:tc>
+        <w:tc>
+          <w:tcPr>
+            <w:tcW w:type="dxa" w:w="3137"/>
+            <w:shd w:val="clear" w:color="auto" w:fill="EAF7F6"/>
+          </w:tcPr>
+          <w:p>
+            <w:pPr>
+              <w:spacing w:after="0"/>
+            </w:pPr>
+            <w:r>
+              <w:rPr>
+                <w:sz w:val="19"/>
+              </w:rPr>
+              <w:t>west 17:45:01.0 → Scotts junction 17:45:09.2</w:t>
+            </w:r>
+          </w:p>
+        </w:tc>
+      </w:tr>
+    </w:tbl>
+    <w:p>
+      <w:pPr>
+        <w:spacing w:after="40"/>
+      </w:pPr>
+    </w:p>
+    <w:p>
+      <w:r>
+        <w:rPr>
+          <w:b/>
+        </w:rPr>
+        <w:t>Test pack, set 2</w:t>
+      </w:r>
+      <w:r>
+        <w:t xml:space="preserve"> (upload the three </w:t>
+      </w:r>
+      <w:r>
+        <w:rPr>
+          <w:rFonts w:ascii="Consolas" w:hAnsi="Consolas"/>
+          <w:color w:val="0E8782"/>
+          <w:sz w:val="20"/>
+        </w:rPr>
+        <w:t>set2_orchard_*.mp4</w:t>
+      </w:r>
+      <w:r>
+        <w:t xml:space="preserve">, optionally with </w:t>
+      </w:r>
+      <w:r>
+        <w:rPr>
+          <w:rFonts w:ascii="Consolas" w:hAnsi="Consolas"/>
+          <w:color w:val="0E8782"/>
+          <w:sz w:val="20"/>
+        </w:rPr>
+        <w:t>set3_bukit_timah.mp4</w:t>
+      </w:r>
+      <w:r>
+        <w:t>)</w:t>
+      </w:r>
+    </w:p>
+    <w:tbl>
+      <w:tblPr>
+        <w:tblStyle w:val="TableGrid"/>
+        <w:tblW w:type="auto" w:w="0"/>
+        <w:jc w:val="center"/>
+        <w:tblLook w:firstColumn="1" w:firstRow="1" w:lastColumn="0" w:lastRow="0" w:noHBand="0" w:noVBand="1" w:val="04A0"/>
+      </w:tblPr>
+      <w:tblGrid>
+        <w:gridCol w:w="3137"/>
+        <w:gridCol w:w="3137"/>
+        <w:gridCol w:w="3137"/>
+      </w:tblGrid>
+      <w:tr>
+        <w:tc>
+          <w:tcPr>
+            <w:tcW w:type="dxa" w:w="3137"/>
+            <w:shd w:val="clear" w:color="auto" w:fill="34454D"/>
+          </w:tcPr>
+          <w:p>
+            <w:pPr>
+              <w:spacing w:after="0"/>
+            </w:pPr>
+            <w:r>
+              <w:rPr>
+                <w:b/>
+                <w:color w:val="FFFFFF"/>
+                <w:sz w:val="19"/>
+              </w:rPr>
+              <w:t>Describe</w:t>
+            </w:r>
+          </w:p>
+        </w:tc>
+        <w:tc>
+          <w:tcPr>
+            <w:tcW w:type="dxa" w:w="3137"/>
+            <w:shd w:val="clear" w:color="auto" w:fill="34454D"/>
+          </w:tcPr>
+          <w:p>
+            <w:pPr>
+              <w:spacing w:after="0"/>
+            </w:pPr>
+            <w:r>
+              <w:rPr>
+                <w:b/>
+                <w:color w:val="FFFFFF"/>
+                <w:sz w:val="19"/>
+              </w:rPr>
+              <w:t>Select</w:t>
+            </w:r>
+          </w:p>
+        </w:tc>
+        <w:tc>
+          <w:tcPr>
+            <w:tcW w:type="dxa" w:w="3137"/>
+            <w:shd w:val="clear" w:color="auto" w:fill="34454D"/>
+          </w:tcPr>
+          <w:p>
+            <w:pPr>
+              <w:spacing w:after="0"/>
+            </w:pPr>
+            <w:r>
+              <w:rPr>
+                <w:b/>
+                <w:color w:val="FFFFFF"/>
+                <w:sz w:val="19"/>
+              </w:rPr>
+              <w:t>Where this vehicle was seen</w:t>
+            </w:r>
+          </w:p>
+        </w:tc>
+      </w:tr>
+      <w:tr>
+        <w:tc>
+          <w:tcPr>
+            <w:tcW w:type="dxa" w:w="3137"/>
+          </w:tcPr>
+          <w:p>
+            <w:pPr>
+              <w:spacing w:after="0"/>
+            </w:pPr>
+            <w:r>
+              <w:rPr>
+                <w:sz w:val="19"/>
+              </w:rPr>
+              <w:t xml:space="preserve">Colour </w:t>
+            </w:r>
+            <w:r>
+              <w:rPr>
+                <w:b/>
+                <w:sz w:val="19"/>
+              </w:rPr>
+              <w:t>red</w:t>
+            </w:r>
+            <w:r>
+              <w:rPr>
+                <w:sz w:val="19"/>
+              </w:rPr>
+              <w:t xml:space="preserve">, Type </w:t>
+            </w:r>
+            <w:r>
+              <w:rPr>
+                <w:b/>
+                <w:sz w:val="19"/>
+              </w:rPr>
+              <w:t>suv</w:t>
+            </w:r>
+          </w:p>
+        </w:tc>
+        <w:tc>
+          <w:tcPr>
+            <w:tcW w:type="dxa" w:w="3137"/>
+          </w:tcPr>
+          <w:p>
+            <w:pPr>
+              <w:spacing w:after="0"/>
+            </w:pPr>
+            <w:r>
+              <w:rPr>
+                <w:sz w:val="19"/>
+              </w:rPr>
+              <w:t>#3 · Scotts junction · 17:45:43.2</w:t>
+            </w:r>
+          </w:p>
+        </w:tc>
+        <w:tc>
+          <w:tcPr>
+            <w:tcW w:type="dxa" w:w="3137"/>
+          </w:tcPr>
+          <w:p>
+            <w:pPr>
+              <w:spacing w:after="0"/>
+            </w:pPr>
+            <w:r>
+              <w:rPr>
+                <w:sz w:val="19"/>
+              </w:rPr>
+              <w:t>west 17:45:37.6 → Scotts junction 17:45:43.2</w:t>
+            </w:r>
+          </w:p>
+        </w:tc>
+      </w:tr>
+      <w:tr>
+        <w:tc>
+          <w:tcPr>
+            <w:tcW w:type="dxa" w:w="3137"/>
+            <w:shd w:val="clear" w:color="auto" w:fill="EAF7F6"/>
+          </w:tcPr>
+          <w:p>
+            <w:pPr>
+              <w:spacing w:after="0"/>
+            </w:pPr>
+            <w:r>
+              <w:rPr>
+                <w:sz w:val="19"/>
+              </w:rPr>
+              <w:t xml:space="preserve">Colour </w:t>
+            </w:r>
+            <w:r>
+              <w:rPr>
+                <w:b/>
+                <w:sz w:val="19"/>
+              </w:rPr>
+              <w:t>gray</w:t>
+            </w:r>
+            <w:r>
+              <w:rPr>
+                <w:sz w:val="19"/>
+              </w:rPr>
+              <w:t xml:space="preserve">, Type </w:t>
+            </w:r>
+            <w:r>
+              <w:rPr>
+                <w:b/>
+                <w:sz w:val="19"/>
+              </w:rPr>
+              <w:t>suv</w:t>
+            </w:r>
+          </w:p>
+        </w:tc>
+        <w:tc>
+          <w:tcPr>
+            <w:tcW w:type="dxa" w:w="3137"/>
+            <w:shd w:val="clear" w:color="auto" w:fill="EAF7F6"/>
+          </w:tcPr>
+          <w:p>
+            <w:pPr>
+              <w:spacing w:after="0"/>
+            </w:pPr>
+            <w:r>
+              <w:rPr>
+                <w:sz w:val="19"/>
+              </w:rPr>
+              <w:t>#2 · west · 17:45:25.4</w:t>
+            </w:r>
+          </w:p>
+        </w:tc>
+        <w:tc>
+          <w:tcPr>
+            <w:tcW w:type="dxa" w:w="3137"/>
+            <w:shd w:val="clear" w:color="auto" w:fill="EAF7F6"/>
+          </w:tcPr>
+          <w:p>
+            <w:pPr>
+              <w:spacing w:after="0"/>
+            </w:pPr>
+            <w:r>
+              <w:rPr>
+                <w:sz w:val="19"/>
+              </w:rPr>
+              <w:t>Scotts junction 17:45:23.8 → west 17:45:25.4</w:t>
+            </w:r>
+          </w:p>
+        </w:tc>
+      </w:tr>
+      <w:tr>
+        <w:tc>
+          <w:tcPr>
+            <w:tcW w:type="dxa" w:w="3137"/>
+          </w:tcPr>
+          <w:p>
+            <w:pPr>
+              <w:spacing w:after="0"/>
+            </w:pPr>
+            <w:r>
+              <w:rPr>
+                <w:sz w:val="19"/>
+              </w:rPr>
+              <w:t xml:space="preserve">Colour </w:t>
+            </w:r>
+            <w:r>
+              <w:rPr>
+                <w:b/>
+                <w:sz w:val="19"/>
+              </w:rPr>
+              <w:t>gray</w:t>
+            </w:r>
+            <w:r>
+              <w:rPr>
+                <w:sz w:val="19"/>
+              </w:rPr>
+              <w:t xml:space="preserve">, Type </w:t>
+            </w:r>
+            <w:r>
+              <w:rPr>
+                <w:b/>
+                <w:sz w:val="19"/>
+              </w:rPr>
+              <w:t>bus</w:t>
+            </w:r>
+          </w:p>
+        </w:tc>
+        <w:tc>
+          <w:tcPr>
+            <w:tcW w:type="dxa" w:w="3137"/>
+          </w:tcPr>
+          <w:p>
+            <w:pPr>
+              <w:spacing w:after="0"/>
+            </w:pPr>
+            <w:r>
+              <w:rPr>
+                <w:sz w:val="19"/>
+              </w:rPr>
+              <w:t>#2 · west · 17:45:36.2</w:t>
+            </w:r>
+          </w:p>
+        </w:tc>
+        <w:tc>
+          <w:tcPr>
+            <w:tcW w:type="dxa" w:w="3137"/>
+          </w:tcPr>
+          <w:p>
+            <w:pPr>
+              <w:spacing w:after="0"/>
+            </w:pPr>
+            <w:r>
+              <w:rPr>
+                <w:sz w:val="19"/>
+              </w:rPr>
+              <w:t>west 17:45:36.2 → Scotts junction 17:45:37.4</w:t>
+            </w:r>
+          </w:p>
+        </w:tc>
+      </w:tr>
+      <w:tr>
+        <w:tc>
+          <w:tcPr>
+            <w:tcW w:type="dxa" w:w="3137"/>
+            <w:shd w:val="clear" w:color="auto" w:fill="EAF7F6"/>
+          </w:tcPr>
+          <w:p>
+            <w:pPr>
+              <w:spacing w:after="0"/>
+            </w:pPr>
+            <w:r>
+              <w:rPr>
+                <w:sz w:val="19"/>
+              </w:rPr>
+              <w:t xml:space="preserve">Type </w:t>
+            </w:r>
+            <w:r>
+              <w:rPr>
+                <w:b/>
+                <w:sz w:val="19"/>
+              </w:rPr>
+              <w:t>bus</w:t>
+            </w:r>
+            <w:r>
+              <w:rPr>
+                <w:sz w:val="19"/>
+              </w:rPr>
+              <w:t xml:space="preserve"> (Colour any)</w:t>
+            </w:r>
+          </w:p>
+        </w:tc>
+        <w:tc>
+          <w:tcPr>
+            <w:tcW w:type="dxa" w:w="3137"/>
+            <w:shd w:val="clear" w:color="auto" w:fill="EAF7F6"/>
+          </w:tcPr>
+          <w:p>
+            <w:pPr>
+              <w:spacing w:after="0"/>
+            </w:pPr>
+            <w:r>
+              <w:rPr>
+                <w:sz w:val="19"/>
+              </w:rPr>
+              <w:t>#4 · west · 17:45:36.2</w:t>
+            </w:r>
+          </w:p>
+        </w:tc>
+        <w:tc>
+          <w:tcPr>
+            <w:tcW w:type="dxa" w:w="3137"/>
+            <w:shd w:val="clear" w:color="auto" w:fill="EAF7F6"/>
+          </w:tcPr>
+          <w:p>
+            <w:pPr>
+              <w:spacing w:after="0"/>
+            </w:pPr>
+            <w:r>
+              <w:rPr>
+                <w:sz w:val="19"/>
+              </w:rPr>
+              <w:t>same bus as above</w:t>
+            </w:r>
+          </w:p>
+        </w:tc>
+      </w:tr>
+    </w:tbl>
+    <w:p>
+      <w:pPr>
+        <w:spacing w:after="40"/>
+      </w:pPr>
+    </w:p>
+    <w:p>
+      <w:r>
+        <w:t xml:space="preserve">In the test sets the east camera is listed under </w:t>
+      </w:r>
+      <w:r>
+        <w:rPr>
+          <w:i/>
+        </w:rPr>
+        <w:t>Not seen in</w:t>
+      </w:r>
+      <w:r>
+        <w:t xml:space="preserve"> with its closest vehicles: with </w:t>
+      </w:r>
+      <w:r>
+        <w:rPr>
+          <w:i/>
+        </w:rPr>
+        <w:t>Fast processing</w:t>
+      </w:r>
+      <w:r>
+        <w:t xml:space="preserve"> the car is seen there too briefly to keep, or no candidate is a confident match.</w:t>
+      </w:r>
+    </w:p>
+    <w:p>
+      <w:r>
+        <w:rPr>
+          <w:b/>
+        </w:rPr>
+        <w:t>Test pack, set 3</w:t>
+      </w:r>
+      <w:r>
+        <w:t xml:space="preserve"> (Bukit Timah Road, uploaded together with set 1 or 2)</w:t>
+      </w:r>
+    </w:p>
+    <w:tbl>
+      <w:tblPr>
+        <w:tblStyle w:val="TableGrid"/>
+        <w:tblW w:type="auto" w:w="0"/>
+        <w:jc w:val="center"/>
+        <w:tblLook w:firstColumn="1" w:firstRow="1" w:lastColumn="0" w:lastRow="0" w:noHBand="0" w:noVBand="1" w:val="04A0"/>
+      </w:tblPr>
+      <w:tblGrid>
+        <w:gridCol w:w="3137"/>
+        <w:gridCol w:w="3137"/>
+        <w:gridCol w:w="3137"/>
+      </w:tblGrid>
+      <w:tr>
+        <w:tc>
+          <w:tcPr>
+            <w:tcW w:type="dxa" w:w="3137"/>
+            <w:shd w:val="clear" w:color="auto" w:fill="34454D"/>
+          </w:tcPr>
+          <w:p>
+            <w:pPr>
+              <w:spacing w:after="0"/>
+            </w:pPr>
+            <w:r>
+              <w:rPr>
+                <w:b/>
+                <w:color w:val="FFFFFF"/>
+                <w:sz w:val="19"/>
+              </w:rPr>
+              <w:t>Describe</w:t>
+            </w:r>
+          </w:p>
+        </w:tc>
+        <w:tc>
+          <w:tcPr>
+            <w:tcW w:type="dxa" w:w="3137"/>
+            <w:shd w:val="clear" w:color="auto" w:fill="34454D"/>
+          </w:tcPr>
+          <w:p>
+            <w:pPr>
+              <w:spacing w:after="0"/>
+            </w:pPr>
+            <w:r>
+              <w:rPr>
+                <w:b/>
+                <w:color w:val="FFFFFF"/>
+                <w:sz w:val="19"/>
+              </w:rPr>
+              <w:t>Top Bukit Timah result</w:t>
+            </w:r>
+          </w:p>
+        </w:tc>
+        <w:tc>
+          <w:tcPr>
+            <w:tcW w:type="dxa" w:w="3137"/>
+            <w:shd w:val="clear" w:color="auto" w:fill="34454D"/>
+          </w:tcPr>
+          <w:p>
+            <w:pPr>
+              <w:spacing w:after="0"/>
+            </w:pPr>
+            <w:r>
+              <w:rPr>
+                <w:b/>
+                <w:color w:val="FFFFFF"/>
+                <w:sz w:val="19"/>
+              </w:rPr>
+              <w:t>Where this vehicle was seen</w:t>
+            </w:r>
+          </w:p>
+        </w:tc>
+      </w:tr>
+      <w:tr>
+        <w:tc>
+          <w:tcPr>
+            <w:tcW w:type="dxa" w:w="3137"/>
+          </w:tcPr>
+          <w:p>
+            <w:pPr>
+              <w:spacing w:after="0"/>
+            </w:pPr>
+            <w:r>
+              <w:rPr>
+                <w:sz w:val="19"/>
+              </w:rPr>
+              <w:t xml:space="preserve">Colour </w:t>
+            </w:r>
+            <w:r>
+              <w:rPr>
+                <w:b/>
+                <w:sz w:val="19"/>
+              </w:rPr>
+              <w:t>black</w:t>
+            </w:r>
+            <w:r>
+              <w:rPr>
+                <w:sz w:val="19"/>
+              </w:rPr>
+              <w:t xml:space="preserve">, Type </w:t>
+            </w:r>
+            <w:r>
+              <w:rPr>
+                <w:b/>
+                <w:sz w:val="19"/>
+              </w:rPr>
+              <w:t>sedan</w:t>
+            </w:r>
+          </w:p>
+        </w:tc>
+        <w:tc>
+          <w:tcPr>
+            <w:tcW w:type="dxa" w:w="3137"/>
+          </w:tcPr>
+          <w:p>
+            <w:pPr>
+              <w:spacing w:after="0"/>
+            </w:pPr>
+            <w:r>
+              <w:rPr>
+                <w:sz w:val="19"/>
+              </w:rPr>
+              <w:t>Bukit Timah · 17:48:02.0</w:t>
+            </w:r>
+          </w:p>
+        </w:tc>
+        <w:tc>
+          <w:tcPr>
+            <w:tcW w:type="dxa" w:w="3137"/>
+          </w:tcPr>
+          <w:p>
+            <w:pPr>
+              <w:spacing w:after="0"/>
+            </w:pPr>
+            <w:r>
+              <w:rPr>
+                <w:sz w:val="19"/>
+              </w:rPr>
+              <w:t xml:space="preserve">only Bukit Timah Road; Orchard Road cameras </w:t>
+            </w:r>
+            <w:r>
+              <w:rPr>
+                <w:i/>
+                <w:sz w:val="19"/>
+              </w:rPr>
+              <w:t>Not seen</w:t>
+            </w:r>
+          </w:p>
+        </w:tc>
+      </w:tr>
+      <w:tr>
+        <w:tc>
+          <w:tcPr>
+            <w:tcW w:type="dxa" w:w="3137"/>
+            <w:shd w:val="clear" w:color="auto" w:fill="EAF7F6"/>
+          </w:tcPr>
+          <w:p>
+            <w:pPr>
+              <w:spacing w:after="0"/>
+            </w:pPr>
+            <w:r>
+              <w:rPr>
+                <w:sz w:val="19"/>
+              </w:rPr>
+              <w:t xml:space="preserve">Colour </w:t>
+            </w:r>
+            <w:r>
+              <w:rPr>
+                <w:b/>
+                <w:sz w:val="19"/>
+              </w:rPr>
+              <w:t>white</w:t>
+            </w:r>
+            <w:r>
+              <w:rPr>
+                <w:sz w:val="19"/>
+              </w:rPr>
+              <w:t xml:space="preserve">, Type </w:t>
+            </w:r>
+            <w:r>
+              <w:rPr>
+                <w:b/>
+                <w:sz w:val="19"/>
+              </w:rPr>
+              <w:t>van</w:t>
+            </w:r>
+          </w:p>
+        </w:tc>
+        <w:tc>
+          <w:tcPr>
+            <w:tcW w:type="dxa" w:w="3137"/>
+            <w:shd w:val="clear" w:color="auto" w:fill="EAF7F6"/>
+          </w:tcPr>
+          <w:p>
+            <w:pPr>
+              <w:spacing w:after="0"/>
+            </w:pPr>
+            <w:r>
+              <w:rPr>
+                <w:sz w:val="19"/>
+              </w:rPr>
+              <w:t>Bukit Timah · 17:48:01.2</w:t>
+            </w:r>
+          </w:p>
+        </w:tc>
+        <w:tc>
+          <w:tcPr>
+            <w:tcW w:type="dxa" w:w="3137"/>
+            <w:shd w:val="clear" w:color="auto" w:fill="EAF7F6"/>
+          </w:tcPr>
+          <w:p>
+            <w:pPr>
+              <w:spacing w:after="0"/>
+            </w:pPr>
+            <w:r>
+              <w:rPr>
+                <w:sz w:val="19"/>
+              </w:rPr>
+              <w:t>only Bukit Timah Road</w:t>
+            </w:r>
+          </w:p>
+        </w:tc>
+      </w:tr>
+      <w:tr>
+        <w:tc>
+          <w:tcPr>
+            <w:tcW w:type="dxa" w:w="3137"/>
+          </w:tcPr>
+          <w:p>
+            <w:pPr>
+              <w:spacing w:after="0"/>
+            </w:pPr>
+            <w:r>
+              <w:rPr>
+                <w:sz w:val="19"/>
+              </w:rPr>
+              <w:t xml:space="preserve">Type </w:t>
+            </w:r>
+            <w:r>
+              <w:rPr>
+                <w:b/>
+                <w:sz w:val="19"/>
+              </w:rPr>
+              <w:t>bus</w:t>
+            </w:r>
+          </w:p>
+        </w:tc>
+        <w:tc>
+          <w:tcPr>
+            <w:tcW w:type="dxa" w:w="3137"/>
+          </w:tcPr>
+          <w:p>
+            <w:pPr>
+              <w:spacing w:after="0"/>
+            </w:pPr>
+            <w:r>
+              <w:rPr>
+                <w:sz w:val="19"/>
+              </w:rPr>
+              <w:t>Bukit Timah · 17:48:11.6</w:t>
+            </w:r>
+          </w:p>
+        </w:tc>
+        <w:tc>
+          <w:tcPr>
+            <w:tcW w:type="dxa" w:w="3137"/>
+          </w:tcPr>
+          <w:p>
+            <w:pPr>
+              <w:spacing w:after="0"/>
+            </w:pPr>
+            <w:r>
+              <w:rPr>
+                <w:sz w:val="19"/>
+              </w:rPr>
+              <w:t xml:space="preserve">only Bukit Timah Road. Turn off </w:t>
+            </w:r>
+            <w:r>
+              <w:rPr>
+                <w:i/>
+                <w:sz w:val="19"/>
+              </w:rPr>
+              <w:t>Limit by real-world time</w:t>
+            </w:r>
+            <w:r>
+              <w:rPr>
+                <w:sz w:val="19"/>
+              </w:rPr>
+              <w:t xml:space="preserve"> (Settings) and it is wrongly matched to two Orchard Road cameras: this shows why the time limit matters</w:t>
+            </w:r>
+          </w:p>
+        </w:tc>
+      </w:tr>
+    </w:tbl>
+    <w:p>
+      <w:pPr>
+        <w:spacing w:after="40"/>
+      </w:pPr>
+    </w:p>
+    <w:p>
+      <w:r>
+        <w:rPr>
+          <w:b/>
+        </w:rPr>
+        <w:t>Combinations to avoid in a live demo</w:t>
+      </w:r>
+      <w:r>
+        <w:t xml:space="preserve"> (checked: the suggested match is a different vehicle): demo Colour gray + Type suv #4, Colour white + Type van, Colour green #4.</w:t>
+      </w:r>
+    </w:p>
+    <w:p>
+      <w:pPr>
+        <w:pStyle w:val="Heading2"/>
+      </w:pPr>
+      <w:r>
+        <w:t>4. Things to try (assessors)</w:t>
       </w:r>
     </w:p>
     <w:tbl>

</xml_diff>

<commit_message>
Settings moved from the sidebar to the Cameras page; final deck cut to 10 slides
- Sidebar: video source, camera count, sign out only; matching settings (threshold, time limit,
  max time, fast processing) on the Cameras page, kept across pages
- Deck: dropped the slides already in the proposal deck (problem, user flow, data, technique groups);
  the title notes recap the problem, the demo-results notes describe the footage
- Screenshots, report, demo guide and docs updated

Co-Authored-By: Claude Opus 5.5 <noreply@anthropic.com>
</commit_message>
<xml_diff>
--- a/deliverables/V-Trace_Demo_Guide.docx
+++ b/deliverables/V-Trace_Demo_Guide.docx
@@ -576,7 +576,25 @@
         <w:t>Not seen</w:t>
       </w:r>
       <w:r>
-        <w:t xml:space="preserve">. Sidebar → Settings → </w:t>
+        <w:t xml:space="preserve">. </w:t>
+      </w:r>
+      <w:r>
+        <w:rPr>
+          <w:b/>
+        </w:rPr>
+        <w:t>Cameras</w:t>
+      </w:r>
+      <w:r>
+        <w:t xml:space="preserve"> page → </w:t>
+      </w:r>
+      <w:r>
+        <w:rPr>
+          <w:i/>
+        </w:rPr>
+        <w:t>Matching settings</w:t>
+      </w:r>
+      <w:r>
+        <w:t xml:space="preserve"> → </w:t>
       </w:r>
       <w:r>
         <w:rPr>
@@ -739,7 +757,25 @@
     </w:p>
     <w:p>
       <w:r>
-        <w:t xml:space="preserve">unknown clocks the real-world time limit stays off (Settings). Details can be edited later on the </w:t>
+        <w:t>unknown clocks the real-world time limit stays off (</w:t>
+      </w:r>
+      <w:r>
+        <w:rPr>
+          <w:b/>
+        </w:rPr>
+        <w:t>Cameras</w:t>
+      </w:r>
+      <w:r>
+        <w:t xml:space="preserve"> page → </w:t>
+      </w:r>
+      <w:r>
+        <w:rPr>
+          <w:i/>
+        </w:rPr>
+        <w:t>Matching settings</w:t>
+      </w:r>
+      <w:r>
+        <w:t xml:space="preserve">). Details can be edited later on the </w:t>
       </w:r>
       <w:r>
         <w:rPr>
@@ -2423,7 +2459,20 @@
               <w:rPr>
                 <w:sz w:val="19"/>
               </w:rPr>
-              <w:t xml:space="preserve"> (Settings) and it is wrongly matched to two Orchard Road cameras: this shows why the time limit matters</w:t>
+              <w:t xml:space="preserve"> (</w:t>
+            </w:r>
+            <w:r>
+              <w:rPr>
+                <w:b/>
+                <w:sz w:val="19"/>
+              </w:rPr>
+              <w:t>Cameras</w:t>
+            </w:r>
+            <w:r>
+              <w:rPr>
+                <w:sz w:val="19"/>
+              </w:rPr>
+              <w:t xml:space="preserve"> page) and it is wrongly matched to two Orchard Road cameras: this shows why the time limit matters</w:t>
             </w:r>
           </w:p>
         </w:tc>
@@ -2787,7 +2836,7 @@
               <w:rPr>
                 <w:sz w:val="19"/>
               </w:rPr>
-              <w:t>sidebar → Settings</w:t>
+              <w:t>Cameras page → Matching settings</w:t>
             </w:r>
           </w:p>
         </w:tc>

</xml_diff>

<commit_message>
Final report condensed to 6 pages around the four required topics
Tools/techniques, system design/models, system performance, findings and discussion; no separate
contents page; V-Trace logo on the title page (the NUS-ISS logo path no longer existed).

Co-Authored-By: Claude Opus 5.5 <noreply@anthropic.com>
</commit_message>
<xml_diff>
--- a/deliverables/V-Trace_Demo_Guide.docx
+++ b/deliverables/V-Trace_Demo_Guide.docx
@@ -2,6 +2,42 @@
 <file path=word/document.xml><?xml version="1.0" encoding="utf-8"?>
 <w:document xmlns:wpc="http://schemas.microsoft.com/office/word/2010/wordprocessingCanvas" xmlns:mo="http://schemas.microsoft.com/office/mac/office/2008/main" xmlns:mc="http://schemas.openxmlformats.org/markup-compatibility/2006" xmlns:mv="urn:schemas-microsoft-com:mac:vml" xmlns:o="urn:schemas-microsoft-com:office:office" xmlns:r="http://schemas.openxmlformats.org/officeDocument/2006/relationships" xmlns:m="http://schemas.openxmlformats.org/officeDocument/2006/math" xmlns:v="urn:schemas-microsoft-com:vml" xmlns:wp14="http://schemas.microsoft.com/office/word/2010/wordprocessingDrawing" xmlns:wp="http://schemas.openxmlformats.org/drawingml/2006/wordprocessingDrawing" xmlns:w10="urn:schemas-microsoft-com:office:word" xmlns:w="http://schemas.openxmlformats.org/wordprocessingml/2006/main" xmlns:w14="http://schemas.microsoft.com/office/word/2010/wordml" xmlns:wpg="http://schemas.microsoft.com/office/word/2010/wordprocessingGroup" xmlns:wpi="http://schemas.microsoft.com/office/word/2010/wordprocessingInk" xmlns:wne="http://schemas.microsoft.com/office/word/2006/wordml" xmlns:wps="http://schemas.microsoft.com/office/word/2010/wordprocessingShape" mc:Ignorable="w14 wp14">
   <w:body>
+    <w:p>
+      <w:r>
+        <w:drawing>
+          <wp:inline xmlns:a="http://schemas.openxmlformats.org/drawingml/2006/main" xmlns:pic="http://schemas.openxmlformats.org/drawingml/2006/picture">
+            <wp:extent cx="2160000" cy="594693"/>
+            <wp:docPr id="1" name="Picture 1"/>
+            <wp:cNvGraphicFramePr>
+              <a:graphicFrameLocks noChangeAspect="1"/>
+            </wp:cNvGraphicFramePr>
+            <a:graphic>
+              <a:graphicData uri="http://schemas.openxmlformats.org/drawingml/2006/picture">
+                <pic:pic>
+                  <pic:nvPicPr>
+                    <pic:cNvPr id="0" name="vtrace_logo_light.png"/>
+                    <pic:cNvPicPr/>
+                  </pic:nvPicPr>
+                  <pic:blipFill>
+                    <a:blip r:embed="rId9"/>
+                    <a:stretch>
+                      <a:fillRect/>
+                    </a:stretch>
+                  </pic:blipFill>
+                  <pic:spPr>
+                    <a:xfrm>
+                      <a:off x="0" y="0"/>
+                      <a:ext cx="2160000" cy="594693"/>
+                    </a:xfrm>
+                    <a:prstGeom prst="rect"/>
+                  </pic:spPr>
+                </pic:pic>
+              </a:graphicData>
+            </a:graphic>
+          </wp:inline>
+        </w:drawing>
+      </w:r>
+    </w:p>
     <w:p/>
     <w:p/>
     <w:p/>
@@ -37,7 +73,7 @@
     <w:p>
       <w:pPr>
         <w:sectPr>
-          <w:footerReference w:type="default" r:id="rId9"/>
+          <w:footerReference w:type="default" r:id="rId10"/>
           <w:pgSz w:w="11906" w:h="16838"/>
           <w:pgMar w:top="1247" w:right="1247" w:bottom="1247" w:left="1247" w:header="720" w:footer="720" w:gutter="0"/>
           <w:cols w:space="720"/>
@@ -2999,7 +3035,7 @@
       </w:r>
     </w:p>
     <w:sectPr>
-      <w:footerReference w:type="default" r:id="rId10"/>
+      <w:footerReference w:type="default" r:id="rId11"/>
       <w:pgSz w:w="11906" w:h="16838"/>
       <w:pgMar w:top="1247" w:right="1247" w:bottom="1247" w:left="1247" w:header="720" w:footer="720" w:gutter="0"/>
       <w:cols w:space="720"/>

</xml_diff>